<commit_message>
docs(ddocp): refresh tmp pack for hand-in
Replace the zip and report with the figured word file and
typed own-work statement so AfriHUB has the current pack.
</commit_message>
<xml_diff>
--- a/tmp/ddocp/P0013366_Edem-Angel Edem-Hogan_Designing and Developing Object-Oriented Computer Programs.docx
+++ b/tmp/ddocp/P0013366_Edem-Angel Edem-Hogan_Designing and Developing Object-Oriented Computer Programs.docx
@@ -4,9 +4,872 @@
   <w:body>
     <w:p>
       <w:pPr>
+        <w:pStyle w:val="BodyText"/>
+        <w:bidi w:val="0"/>
+        <w:spacing w:lineRule="auto" w:line="240" w:before="0" w:after="0"/>
+        <w:ind w:hanging="0" w:start="0" w:end="0"/>
+        <w:jc w:val="start"/>
+        <w:rPr/>
+      </w:pPr>
+      <w:r>
+        <w:rPr/>
+      </w:r>
+    </w:p>
+    <w:p>
+      <w:pPr>
+        <w:sectPr>
+          <w:headerReference w:type="default" r:id="rId2"/>
+          <w:footerReference w:type="default" r:id="rId3"/>
+          <w:type w:val="nextPage"/>
+          <w:pgSz w:w="12240" w:h="15840"/>
+          <w:pgMar w:left="1417" w:right="1134" w:gutter="0" w:header="1134" w:top="2438" w:footer="1134" w:bottom="2475"/>
+          <w:pgNumType w:fmt="decimal"/>
+          <w:formProt w:val="false"/>
+          <w:textDirection w:val="lrTb"/>
+          <w:docGrid w:type="default" w:linePitch="600" w:charSpace="36864"/>
+        </w:sectPr>
+      </w:pPr>
+    </w:p>
+    <w:p>
+      <w:pPr>
+        <w:pStyle w:val="BodyText"/>
+        <w:bidi w:val="0"/>
+        <w:spacing w:lineRule="auto" w:line="240" w:before="0" w:after="0"/>
+        <w:ind w:hanging="0" w:start="0" w:end="0"/>
+        <w:jc w:val="both"/>
+        <w:rPr/>
+      </w:pPr>
+      <w:r>
+        <w:rPr/>
+      </w:r>
+    </w:p>
+    <w:tbl>
+      <w:tblPr>
+        <w:tblW w:w="9885" w:type="dxa"/>
+        <w:jc w:val="start"/>
+        <w:tblInd w:w="-22" w:type="dxa"/>
+        <w:tblLayout w:type="fixed"/>
+        <w:tblCellMar>
+          <w:top w:w="28" w:type="dxa"/>
+          <w:start w:w="115" w:type="dxa"/>
+          <w:bottom w:w="28" w:type="dxa"/>
+          <w:end w:w="115" w:type="dxa"/>
+        </w:tblCellMar>
+      </w:tblPr>
+      <w:tblGrid>
+        <w:gridCol w:w="9885"/>
+      </w:tblGrid>
+      <w:tr>
+        <w:trPr/>
+        <w:tc>
+          <w:tcPr>
+            <w:tcW w:w="9885" w:type="dxa"/>
+            <w:tcBorders>
+              <w:top w:val="double" w:sz="6" w:space="0" w:color="000000"/>
+              <w:start w:val="double" w:sz="6" w:space="0" w:color="000000"/>
+              <w:bottom w:val="double" w:sz="6" w:space="0" w:color="000000"/>
+              <w:end w:val="double" w:sz="6" w:space="0" w:color="000000"/>
+            </w:tcBorders>
+          </w:tcPr>
+          <w:p>
+            <w:pPr>
+              <w:pStyle w:val="TableContents"/>
+              <w:bidi w:val="0"/>
+              <w:spacing w:before="0" w:after="0"/>
+              <w:ind w:hanging="0" w:start="0" w:end="0"/>
+              <w:jc w:val="center"/>
+              <w:rPr>
+                <w:b/>
+                <w:i/>
+                <w:sz w:val="24"/>
+              </w:rPr>
+            </w:pPr>
+            <w:r>
+              <w:rPr>
+                <w:b/>
+                <w:i/>
+                <w:sz w:val="24"/>
+              </w:rPr>
+              <w:t>A signed copy of this form must be submitted with every assignment.</w:t>
+            </w:r>
+          </w:p>
+          <w:p>
+            <w:pPr>
+              <w:pStyle w:val="TableContents"/>
+              <w:bidi w:val="0"/>
+              <w:spacing w:before="0" w:after="283"/>
+              <w:ind w:hanging="0" w:start="0" w:end="0"/>
+              <w:jc w:val="center"/>
+              <w:rPr>
+                <w:b/>
+                <w:i/>
+                <w:sz w:val="24"/>
+              </w:rPr>
+            </w:pPr>
+            <w:r>
+              <w:rPr>
+                <w:b/>
+                <w:i/>
+                <w:sz w:val="24"/>
+              </w:rPr>
+              <w:t>If the statement is missing your work may not be marked.</w:t>
+            </w:r>
+          </w:p>
+        </w:tc>
+      </w:tr>
+    </w:tbl>
+    <w:p>
+      <w:pPr>
+        <w:pStyle w:val="BodyText"/>
+        <w:bidi w:val="0"/>
+        <w:spacing w:lineRule="auto" w:line="240" w:before="0" w:after="0"/>
+        <w:ind w:hanging="0" w:start="0" w:end="0"/>
+        <w:jc w:val="both"/>
+        <w:rPr/>
+      </w:pPr>
+      <w:r>
+        <w:rPr/>
+      </w:r>
+    </w:p>
+    <w:p>
+      <w:pPr>
+        <w:pStyle w:val="BodyText"/>
+        <w:bidi w:val="0"/>
+        <w:spacing w:lineRule="auto" w:line="240" w:before="0" w:after="0"/>
+        <w:ind w:hanging="0" w:start="0" w:end="0"/>
+        <w:jc w:val="both"/>
+        <w:rPr/>
+      </w:pPr>
+      <w:r>
+        <w:rPr/>
+      </w:r>
+    </w:p>
+    <w:p>
+      <w:pPr>
+        <w:pStyle w:val="BodyText"/>
+        <w:bidi w:val="0"/>
+        <w:spacing w:lineRule="auto" w:line="240" w:before="0" w:after="0"/>
+        <w:ind w:hanging="0" w:start="0" w:end="0"/>
+        <w:jc w:val="center"/>
+        <w:rPr>
+          <w:b/>
+          <w:sz w:val="28"/>
+          <w:u w:val="single"/>
+        </w:rPr>
+      </w:pPr>
+      <w:r>
+        <w:rPr>
+          <w:b/>
+          <w:sz w:val="28"/>
+          <w:u w:val="single"/>
+        </w:rPr>
+        <w:t>Student Declaration</w:t>
+      </w:r>
+    </w:p>
+    <w:p>
+      <w:pPr>
+        <w:pStyle w:val="BodyText"/>
+        <w:bidi w:val="0"/>
+        <w:spacing w:lineRule="auto" w:line="240" w:before="0" w:after="0"/>
+        <w:ind w:hanging="0" w:start="0" w:end="0"/>
+        <w:jc w:val="both"/>
+        <w:rPr/>
+      </w:pPr>
+      <w:r>
+        <w:rPr/>
+      </w:r>
+    </w:p>
+    <w:p>
+      <w:pPr>
+        <w:pStyle w:val="BodyText"/>
+        <w:bidi w:val="0"/>
+        <w:spacing w:lineRule="auto" w:line="240" w:before="0" w:after="0"/>
+        <w:ind w:hanging="0" w:start="0" w:end="0"/>
+        <w:jc w:val="both"/>
+        <w:rPr/>
+      </w:pPr>
+      <w:r>
+        <w:rPr/>
+      </w:r>
+    </w:p>
+    <w:p>
+      <w:pPr>
+        <w:pStyle w:val="BodyText"/>
+        <w:bidi w:val="0"/>
+        <w:spacing w:lineRule="auto" w:line="240" w:before="0" w:after="0"/>
+        <w:ind w:hanging="0" w:start="0" w:end="0"/>
+        <w:jc w:val="both"/>
+        <w:rPr>
+          <w:b w:val="false"/>
+          <w:sz w:val="24"/>
+        </w:rPr>
+      </w:pPr>
+      <w:r>
+        <w:rPr>
+          <w:b w:val="false"/>
+          <w:sz w:val="24"/>
+        </w:rPr>
+        <w:t>I confirm the following details:</w:t>
+      </w:r>
+    </w:p>
+    <w:p>
+      <w:pPr>
+        <w:pStyle w:val="BodyText"/>
+        <w:bidi w:val="0"/>
+        <w:spacing w:lineRule="auto" w:line="240" w:before="0" w:after="0"/>
+        <w:ind w:hanging="0" w:start="0" w:end="0"/>
+        <w:jc w:val="both"/>
+        <w:rPr/>
+      </w:pPr>
+      <w:r>
+        <w:rPr/>
+      </w:r>
+    </w:p>
+    <w:tbl>
+      <w:tblPr>
+        <w:tblW w:w="9885" w:type="dxa"/>
+        <w:jc w:val="start"/>
+        <w:tblInd w:w="0" w:type="dxa"/>
+        <w:tblLayout w:type="fixed"/>
+        <w:tblCellMar>
+          <w:top w:w="28" w:type="dxa"/>
+          <w:start w:w="115" w:type="dxa"/>
+          <w:bottom w:w="28" w:type="dxa"/>
+          <w:end w:w="115" w:type="dxa"/>
+        </w:tblCellMar>
+      </w:tblPr>
+      <w:tblGrid>
+        <w:gridCol w:w="3225"/>
+        <w:gridCol w:w="6660"/>
+      </w:tblGrid>
+      <w:tr>
+        <w:trPr/>
+        <w:tc>
+          <w:tcPr>
+            <w:tcW w:w="3225" w:type="dxa"/>
+            <w:tcBorders>
+              <w:top w:val="single" w:sz="2" w:space="0" w:color="000000"/>
+              <w:start w:val="single" w:sz="2" w:space="0" w:color="000000"/>
+              <w:bottom w:val="single" w:sz="2" w:space="0" w:color="000000"/>
+              <w:end w:val="single" w:sz="2" w:space="0" w:color="000000"/>
+            </w:tcBorders>
+          </w:tcPr>
+          <w:p>
+            <w:pPr>
+              <w:pStyle w:val="TableContents"/>
+              <w:bidi w:val="0"/>
+              <w:spacing w:before="245" w:after="0"/>
+              <w:ind w:hanging="0" w:start="0" w:end="0"/>
+              <w:jc w:val="both"/>
+              <w:rPr>
+                <w:rFonts w:ascii="Arial;sans-serif" w:hAnsi="Arial;sans-serif"/>
+                <w:b/>
+                <w:color w:val="000000"/>
+                <w:sz w:val="24"/>
+              </w:rPr>
+            </w:pPr>
+            <w:r>
+              <w:rPr>
+                <w:b/>
+                <w:color w:val="000000"/>
+                <w:sz w:val="24"/>
+              </w:rPr>
+              <w:t>Candidate Name:</w:t>
+            </w:r>
+          </w:p>
+        </w:tc>
+        <w:tc>
+          <w:tcPr>
+            <w:tcW w:w="6660" w:type="dxa"/>
+            <w:tcBorders>
+              <w:top w:val="single" w:sz="2" w:space="0" w:color="000000"/>
+              <w:start w:val="single" w:sz="2" w:space="0" w:color="000000"/>
+              <w:bottom w:val="single" w:sz="2" w:space="0" w:color="000000"/>
+              <w:end w:val="single" w:sz="2" w:space="0" w:color="000000"/>
+            </w:tcBorders>
+          </w:tcPr>
+          <w:p>
+            <w:pPr>
+              <w:pStyle w:val="TableContents"/>
+              <w:bidi w:val="0"/>
+              <w:spacing w:before="245" w:after="0"/>
+              <w:ind w:hanging="0" w:start="0" w:end="0"/>
+              <w:jc w:val="both"/>
+              <w:rPr/>
+            </w:pPr>
+            <w:r>
+              <w:rPr>
+                <w:sz w:val="24"/>
+              </w:rPr>
+              <w:t>Edem Angel Edem Hogan</w:t>
+            </w:r>
+            <w:r>
+              <w:rPr/>
+              <w:t xml:space="preserve"> </w:t>
+            </w:r>
+          </w:p>
+        </w:tc>
+      </w:tr>
+      <w:tr>
+        <w:trPr/>
+        <w:tc>
+          <w:tcPr>
+            <w:tcW w:w="3225" w:type="dxa"/>
+            <w:tcBorders>
+              <w:top w:val="single" w:sz="2" w:space="0" w:color="000000"/>
+              <w:start w:val="single" w:sz="2" w:space="0" w:color="000000"/>
+              <w:bottom w:val="single" w:sz="2" w:space="0" w:color="000000"/>
+              <w:end w:val="single" w:sz="2" w:space="0" w:color="000000"/>
+            </w:tcBorders>
+          </w:tcPr>
+          <w:p>
+            <w:pPr>
+              <w:pStyle w:val="TableContents"/>
+              <w:bidi w:val="0"/>
+              <w:spacing w:before="245" w:after="0"/>
+              <w:ind w:hanging="0" w:start="0" w:end="0"/>
+              <w:jc w:val="both"/>
+              <w:rPr>
+                <w:rFonts w:ascii="Arial;sans-serif" w:hAnsi="Arial;sans-serif"/>
+                <w:b/>
+                <w:color w:val="000000"/>
+                <w:sz w:val="24"/>
+              </w:rPr>
+            </w:pPr>
+            <w:r>
+              <w:rPr>
+                <w:b/>
+                <w:color w:val="000000"/>
+                <w:sz w:val="24"/>
+              </w:rPr>
+              <w:t>Candidate ID Number:</w:t>
+            </w:r>
+          </w:p>
+        </w:tc>
+        <w:tc>
+          <w:tcPr>
+            <w:tcW w:w="6660" w:type="dxa"/>
+            <w:tcBorders>
+              <w:top w:val="single" w:sz="2" w:space="0" w:color="000000"/>
+              <w:start w:val="single" w:sz="2" w:space="0" w:color="000000"/>
+              <w:bottom w:val="single" w:sz="2" w:space="0" w:color="000000"/>
+              <w:end w:val="single" w:sz="2" w:space="0" w:color="000000"/>
+            </w:tcBorders>
+          </w:tcPr>
+          <w:p>
+            <w:pPr>
+              <w:pStyle w:val="TableContents"/>
+              <w:bidi w:val="0"/>
+              <w:spacing w:before="245" w:after="0"/>
+              <w:ind w:hanging="0" w:start="0" w:end="0"/>
+              <w:jc w:val="both"/>
+              <w:rPr/>
+            </w:pPr>
+            <w:r>
+              <w:rPr>
+                <w:b/>
+                <w:color w:val="000000"/>
+                <w:sz w:val="24"/>
+              </w:rPr>
+              <w:t>P0013366</w:t>
+            </w:r>
+            <w:r>
+              <w:rPr/>
+              <w:t xml:space="preserve"> </w:t>
+            </w:r>
+          </w:p>
+        </w:tc>
+      </w:tr>
+      <w:tr>
+        <w:trPr/>
+        <w:tc>
+          <w:tcPr>
+            <w:tcW w:w="3225" w:type="dxa"/>
+            <w:tcBorders>
+              <w:top w:val="single" w:sz="2" w:space="0" w:color="000000"/>
+              <w:start w:val="single" w:sz="2" w:space="0" w:color="000000"/>
+              <w:bottom w:val="single" w:sz="2" w:space="0" w:color="000000"/>
+              <w:end w:val="single" w:sz="2" w:space="0" w:color="000000"/>
+            </w:tcBorders>
+          </w:tcPr>
+          <w:p>
+            <w:pPr>
+              <w:pStyle w:val="TableContents"/>
+              <w:bidi w:val="0"/>
+              <w:spacing w:before="245" w:after="0"/>
+              <w:ind w:hanging="0" w:start="0" w:end="0"/>
+              <w:jc w:val="both"/>
+              <w:rPr>
+                <w:rFonts w:ascii="Arial;sans-serif" w:hAnsi="Arial;sans-serif"/>
+                <w:b/>
+                <w:color w:val="000000"/>
+                <w:sz w:val="24"/>
+              </w:rPr>
+            </w:pPr>
+            <w:r>
+              <w:rPr>
+                <w:b/>
+                <w:color w:val="000000"/>
+                <w:sz w:val="24"/>
+              </w:rPr>
+              <w:t>Qualification:</w:t>
+            </w:r>
+          </w:p>
+        </w:tc>
+        <w:tc>
+          <w:tcPr>
+            <w:tcW w:w="6660" w:type="dxa"/>
+            <w:tcBorders>
+              <w:top w:val="single" w:sz="2" w:space="0" w:color="000000"/>
+              <w:start w:val="single" w:sz="2" w:space="0" w:color="000000"/>
+              <w:bottom w:val="single" w:sz="2" w:space="0" w:color="000000"/>
+              <w:end w:val="single" w:sz="2" w:space="0" w:color="000000"/>
+            </w:tcBorders>
+          </w:tcPr>
+          <w:p>
+            <w:pPr>
+              <w:pStyle w:val="TableContents"/>
+              <w:bidi w:val="0"/>
+              <w:spacing w:before="245" w:after="0"/>
+              <w:ind w:hanging="0" w:start="0" w:end="0"/>
+              <w:jc w:val="both"/>
+              <w:rPr/>
+            </w:pPr>
+            <w:r>
+              <w:rPr>
+                <w:b/>
+                <w:color w:val="000000"/>
+                <w:sz w:val="24"/>
+              </w:rPr>
+              <w:t>Level 4 Diploma in Computing</w:t>
+            </w:r>
+            <w:r>
+              <w:rPr/>
+              <w:t xml:space="preserve"> </w:t>
+            </w:r>
+          </w:p>
+        </w:tc>
+      </w:tr>
+      <w:tr>
+        <w:trPr/>
+        <w:tc>
+          <w:tcPr>
+            <w:tcW w:w="3225" w:type="dxa"/>
+            <w:tcBorders>
+              <w:top w:val="single" w:sz="2" w:space="0" w:color="000000"/>
+              <w:start w:val="single" w:sz="2" w:space="0" w:color="000000"/>
+              <w:bottom w:val="single" w:sz="2" w:space="0" w:color="000000"/>
+              <w:end w:val="single" w:sz="2" w:space="0" w:color="000000"/>
+            </w:tcBorders>
+          </w:tcPr>
+          <w:p>
+            <w:pPr>
+              <w:pStyle w:val="TableContents"/>
+              <w:bidi w:val="0"/>
+              <w:spacing w:before="245" w:after="0"/>
+              <w:ind w:hanging="0" w:start="0" w:end="0"/>
+              <w:jc w:val="both"/>
+              <w:rPr>
+                <w:rFonts w:ascii="Arial;sans-serif" w:hAnsi="Arial;sans-serif"/>
+                <w:b/>
+                <w:color w:val="000000"/>
+                <w:sz w:val="24"/>
+              </w:rPr>
+            </w:pPr>
+            <w:r>
+              <w:rPr>
+                <w:b/>
+                <w:color w:val="000000"/>
+                <w:sz w:val="24"/>
+              </w:rPr>
+              <w:t>Unit:</w:t>
+            </w:r>
+          </w:p>
+        </w:tc>
+        <w:tc>
+          <w:tcPr>
+            <w:tcW w:w="6660" w:type="dxa"/>
+            <w:tcBorders>
+              <w:top w:val="single" w:sz="2" w:space="0" w:color="000000"/>
+              <w:start w:val="single" w:sz="2" w:space="0" w:color="000000"/>
+              <w:bottom w:val="single" w:sz="2" w:space="0" w:color="000000"/>
+              <w:end w:val="single" w:sz="2" w:space="0" w:color="000000"/>
+            </w:tcBorders>
+          </w:tcPr>
+          <w:p>
+            <w:pPr>
+              <w:pStyle w:val="TableContents"/>
+              <w:bidi w:val="0"/>
+              <w:spacing w:before="245" w:after="0"/>
+              <w:ind w:hanging="0" w:start="0" w:end="0"/>
+              <w:jc w:val="both"/>
+              <w:rPr/>
+            </w:pPr>
+            <w:r>
+              <w:rPr>
+                <w:b/>
+                <w:color w:val="000000"/>
+                <w:sz w:val="24"/>
+              </w:rPr>
+              <w:t>Designing and Developing Object-Oriented Computer Programs (1148-1)</w:t>
+            </w:r>
+            <w:r>
+              <w:rPr/>
+              <w:t xml:space="preserve"> </w:t>
+            </w:r>
+          </w:p>
+        </w:tc>
+      </w:tr>
+      <w:tr>
+        <w:trPr/>
+        <w:tc>
+          <w:tcPr>
+            <w:tcW w:w="3225" w:type="dxa"/>
+            <w:tcBorders>
+              <w:top w:val="single" w:sz="2" w:space="0" w:color="000000"/>
+              <w:start w:val="single" w:sz="2" w:space="0" w:color="000000"/>
+              <w:bottom w:val="single" w:sz="2" w:space="0" w:color="000000"/>
+              <w:end w:val="single" w:sz="2" w:space="0" w:color="000000"/>
+            </w:tcBorders>
+          </w:tcPr>
+          <w:p>
+            <w:pPr>
+              <w:pStyle w:val="TableContents"/>
+              <w:bidi w:val="0"/>
+              <w:spacing w:before="245" w:after="0"/>
+              <w:ind w:hanging="0" w:start="0" w:end="0"/>
+              <w:jc w:val="both"/>
+              <w:rPr>
+                <w:rFonts w:ascii="Arial;sans-serif" w:hAnsi="Arial;sans-serif"/>
+                <w:b/>
+                <w:color w:val="000000"/>
+                <w:sz w:val="24"/>
+              </w:rPr>
+            </w:pPr>
+            <w:r>
+              <w:rPr>
+                <w:b/>
+                <w:color w:val="000000"/>
+                <w:sz w:val="24"/>
+              </w:rPr>
+              <w:t>Centre:</w:t>
+            </w:r>
+          </w:p>
+        </w:tc>
+        <w:tc>
+          <w:tcPr>
+            <w:tcW w:w="6660" w:type="dxa"/>
+            <w:tcBorders>
+              <w:top w:val="single" w:sz="2" w:space="0" w:color="000000"/>
+              <w:start w:val="single" w:sz="2" w:space="0" w:color="000000"/>
+              <w:bottom w:val="single" w:sz="2" w:space="0" w:color="000000"/>
+              <w:end w:val="single" w:sz="2" w:space="0" w:color="000000"/>
+            </w:tcBorders>
+          </w:tcPr>
+          <w:p>
+            <w:pPr>
+              <w:pStyle w:val="TableContents"/>
+              <w:bidi w:val="0"/>
+              <w:spacing w:before="245" w:after="0"/>
+              <w:ind w:hanging="0" w:start="0" w:end="0"/>
+              <w:jc w:val="both"/>
+              <w:rPr/>
+            </w:pPr>
+            <w:r>
+              <w:rPr>
+                <w:b/>
+                <w:color w:val="000000"/>
+                <w:sz w:val="24"/>
+              </w:rPr>
+              <w:t>AfriHUB</w:t>
+            </w:r>
+            <w:r>
+              <w:rPr/>
+              <w:t xml:space="preserve"> </w:t>
+            </w:r>
+          </w:p>
+        </w:tc>
+      </w:tr>
+      <w:tr>
+        <w:trPr/>
+        <w:tc>
+          <w:tcPr>
+            <w:tcW w:w="9885" w:type="dxa"/>
+            <w:gridSpan w:val="2"/>
+            <w:tcBorders>
+              <w:top w:val="single" w:sz="2" w:space="0" w:color="000000"/>
+              <w:start w:val="single" w:sz="2" w:space="0" w:color="000000"/>
+              <w:bottom w:val="single" w:sz="2" w:space="0" w:color="000000"/>
+              <w:end w:val="single" w:sz="2" w:space="0" w:color="000000"/>
+            </w:tcBorders>
+          </w:tcPr>
+          <w:p>
+            <w:pPr>
+              <w:pStyle w:val="TableContents"/>
+              <w:bidi w:val="0"/>
+              <w:spacing w:before="0" w:after="0"/>
+              <w:ind w:hanging="0" w:start="0" w:end="0"/>
+              <w:jc w:val="start"/>
+              <w:rPr/>
+            </w:pPr>
+            <w:r>
+              <w:rPr/>
+            </w:r>
+          </w:p>
+          <w:p>
+            <w:pPr>
+              <w:pStyle w:val="TableContents"/>
+              <w:bidi w:val="0"/>
+              <w:spacing w:before="0" w:after="0"/>
+              <w:ind w:hanging="0" w:start="0" w:end="0"/>
+              <w:jc w:val="start"/>
+              <w:rPr>
+                <w:lang w:val="en-GB"/>
+              </w:rPr>
+            </w:pPr>
+            <w:r>
+              <w:rPr>
+                <w:lang w:val="en-GB"/>
+              </w:rPr>
+              <w:t xml:space="preserve">I have read and understood both NCC Education’s </w:t>
+            </w:r>
+            <w:r>
+              <w:rPr>
+                <w:i/>
+                <w:lang w:val="en-GB"/>
+              </w:rPr>
+              <w:t>Academic Misconduct Policy</w:t>
+            </w:r>
+            <w:r>
+              <w:rPr>
+                <w:lang w:val="en-GB"/>
+              </w:rPr>
+              <w:t xml:space="preserve"> and the </w:t>
+            </w:r>
+            <w:r>
+              <w:rPr>
+                <w:i/>
+                <w:lang w:val="en-GB"/>
+              </w:rPr>
+              <w:t>Referencing and Bibliographies</w:t>
+            </w:r>
+            <w:r>
+              <w:rPr>
+                <w:lang w:val="en-GB"/>
+              </w:rPr>
+              <w:t xml:space="preserve"> document. To the best of my knowledge my work has been accurately referenced and all sources cited correctly.</w:t>
+            </w:r>
+          </w:p>
+          <w:p>
+            <w:pPr>
+              <w:pStyle w:val="TableContents"/>
+              <w:bidi w:val="0"/>
+              <w:spacing w:before="245" w:after="0"/>
+              <w:ind w:hanging="0" w:start="0" w:end="0"/>
+              <w:jc w:val="both"/>
+              <w:rPr>
+                <w:b w:val="false"/>
+                <w:sz w:val="24"/>
+              </w:rPr>
+            </w:pPr>
+            <w:r>
+              <w:rPr>
+                <w:b w:val="false"/>
+                <w:sz w:val="24"/>
+              </w:rPr>
+              <w:t>I confirm that this is my own work and that I have not colluded or plagiarised any part of it.</w:t>
+            </w:r>
+          </w:p>
+        </w:tc>
+      </w:tr>
+      <w:tr>
+        <w:trPr/>
+        <w:tc>
+          <w:tcPr>
+            <w:tcW w:w="3225" w:type="dxa"/>
+            <w:tcBorders>
+              <w:top w:val="single" w:sz="2" w:space="0" w:color="000000"/>
+              <w:start w:val="single" w:sz="2" w:space="0" w:color="000000"/>
+              <w:bottom w:val="single" w:sz="2" w:space="0" w:color="000000"/>
+              <w:end w:val="single" w:sz="2" w:space="0" w:color="000000"/>
+            </w:tcBorders>
+          </w:tcPr>
+          <w:p>
+            <w:pPr>
+              <w:pStyle w:val="TableContents"/>
+              <w:bidi w:val="0"/>
+              <w:spacing w:before="245" w:after="0"/>
+              <w:ind w:hanging="0" w:start="0" w:end="0"/>
+              <w:jc w:val="both"/>
+              <w:rPr>
+                <w:rFonts w:ascii="Arial;sans-serif" w:hAnsi="Arial;sans-serif"/>
+                <w:b/>
+                <w:color w:val="000000"/>
+                <w:sz w:val="24"/>
+              </w:rPr>
+            </w:pPr>
+            <w:r>
+              <w:rPr>
+                <w:b/>
+                <w:color w:val="000000"/>
+                <w:sz w:val="24"/>
+              </w:rPr>
+              <w:t>Candidate Signature:</w:t>
+            </w:r>
+          </w:p>
+        </w:tc>
+        <w:tc>
+          <w:tcPr>
+            <w:tcW w:w="6660" w:type="dxa"/>
+            <w:tcBorders>
+              <w:top w:val="single" w:sz="2" w:space="0" w:color="000000"/>
+              <w:start w:val="single" w:sz="2" w:space="0" w:color="000000"/>
+              <w:bottom w:val="single" w:sz="2" w:space="0" w:color="000000"/>
+              <w:end w:val="single" w:sz="2" w:space="0" w:color="000000"/>
+            </w:tcBorders>
+          </w:tcPr>
+          <w:p>
+            <w:pPr>
+              <w:pStyle w:val="TableContents"/>
+              <w:bidi w:val="0"/>
+              <w:spacing w:before="245" w:after="0"/>
+              <w:ind w:hanging="0" w:start="0" w:end="0"/>
+              <w:jc w:val="both"/>
+              <w:rPr/>
+            </w:pPr>
+            <w:r>
+              <w:rPr>
+                <w:b/>
+                <w:color w:val="000000"/>
+                <w:sz w:val="24"/>
+              </w:rPr>
+              <w:t>Edem Angel Edem Hogan (typed; sign the paper copy)</w:t>
+            </w:r>
+            <w:r>
+              <w:rPr/>
+              <w:t xml:space="preserve"> </w:t>
+            </w:r>
+          </w:p>
+        </w:tc>
+      </w:tr>
+      <w:tr>
+        <w:trPr/>
+        <w:tc>
+          <w:tcPr>
+            <w:tcW w:w="3225" w:type="dxa"/>
+            <w:tcBorders>
+              <w:top w:val="single" w:sz="2" w:space="0" w:color="000000"/>
+              <w:start w:val="single" w:sz="2" w:space="0" w:color="000000"/>
+              <w:bottom w:val="single" w:sz="2" w:space="0" w:color="000000"/>
+              <w:end w:val="single" w:sz="2" w:space="0" w:color="000000"/>
+            </w:tcBorders>
+          </w:tcPr>
+          <w:p>
+            <w:pPr>
+              <w:pStyle w:val="TableContents"/>
+              <w:bidi w:val="0"/>
+              <w:spacing w:before="245" w:after="0"/>
+              <w:ind w:hanging="0" w:start="0" w:end="0"/>
+              <w:jc w:val="both"/>
+              <w:rPr>
+                <w:rFonts w:ascii="Arial;sans-serif" w:hAnsi="Arial;sans-serif"/>
+                <w:b/>
+                <w:color w:val="000000"/>
+                <w:sz w:val="24"/>
+              </w:rPr>
+            </w:pPr>
+            <w:r>
+              <w:rPr>
+                <w:b/>
+                <w:color w:val="000000"/>
+                <w:sz w:val="24"/>
+              </w:rPr>
+              <w:t>Date:</w:t>
+            </w:r>
+          </w:p>
+        </w:tc>
+        <w:tc>
+          <w:tcPr>
+            <w:tcW w:w="6660" w:type="dxa"/>
+            <w:tcBorders>
+              <w:top w:val="single" w:sz="2" w:space="0" w:color="000000"/>
+              <w:start w:val="single" w:sz="2" w:space="0" w:color="000000"/>
+              <w:bottom w:val="single" w:sz="2" w:space="0" w:color="000000"/>
+              <w:end w:val="single" w:sz="2" w:space="0" w:color="000000"/>
+            </w:tcBorders>
+          </w:tcPr>
+          <w:p>
+            <w:pPr>
+              <w:pStyle w:val="TableContents"/>
+              <w:bidi w:val="0"/>
+              <w:spacing w:before="245" w:after="0"/>
+              <w:ind w:hanging="0" w:start="0" w:end="0"/>
+              <w:jc w:val="both"/>
+              <w:rPr/>
+            </w:pPr>
+            <w:r>
+              <w:rPr>
+                <w:b/>
+                <w:color w:val="000000"/>
+                <w:sz w:val="24"/>
+              </w:rPr>
+              <w:t>7 October 2026</w:t>
+            </w:r>
+            <w:r>
+              <w:rPr/>
+              <w:t xml:space="preserve"> </w:t>
+            </w:r>
+          </w:p>
+        </w:tc>
+      </w:tr>
+    </w:tbl>
+    <w:p>
+      <w:pPr>
+        <w:pStyle w:val="BodyText"/>
+        <w:bidi w:val="0"/>
+        <w:spacing w:lineRule="auto" w:line="240" w:before="0" w:after="0"/>
+        <w:ind w:hanging="0" w:start="0" w:end="0"/>
+        <w:jc w:val="both"/>
+        <w:rPr/>
+      </w:pPr>
+      <w:r>
+        <w:rPr/>
+      </w:r>
+    </w:p>
+    <w:p>
+      <w:pPr>
+        <w:pStyle w:val="BodyText"/>
+        <w:bidi w:val="0"/>
+        <w:spacing w:lineRule="auto" w:line="240" w:before="0" w:after="0"/>
+        <w:ind w:hanging="0" w:start="0" w:end="0"/>
+        <w:jc w:val="both"/>
+        <w:rPr/>
+      </w:pPr>
+      <w:r>
+        <w:rPr/>
+      </w:r>
+    </w:p>
+    <w:p>
+      <w:pPr>
+        <w:sectPr>
+          <w:type w:val="continuous"/>
+          <w:pgSz w:w="12240" w:h="15840"/>
+          <w:pgMar w:left="1417" w:right="1134" w:gutter="0" w:header="1134" w:top="2438" w:footer="1134" w:bottom="2475"/>
+          <w:formProt w:val="false"/>
+          <w:textDirection w:val="lrTb"/>
+          <w:docGrid w:type="default" w:linePitch="600" w:charSpace="36864"/>
+        </w:sectPr>
+      </w:pPr>
+    </w:p>
+    <w:p>
+      <w:pPr>
         <w:pStyle w:val="Heading1"/>
-        <w:bidi w:val="0"/>
-        <w:spacing w:before="240" w:after="283"/>
+        <w:numPr>
+          <w:ilvl w:val="0"/>
+          <w:numId w:val="0"/>
+        </w:numPr>
+        <w:bidi w:val="0"/>
+        <w:spacing w:before="240" w:after="120"/>
         <w:jc w:val="start"/>
         <w:rPr/>
       </w:pPr>
@@ -19,7 +882,7 @@
       <w:pPr>
         <w:pStyle w:val="BodyText"/>
         <w:bidi w:val="0"/>
-        <w:spacing w:before="0" w:after="283"/>
+        <w:spacing w:lineRule="auto" w:line="276" w:before="0" w:after="140"/>
         <w:jc w:val="start"/>
         <w:rPr/>
       </w:pPr>
@@ -32,7 +895,7 @@
       <w:pPr>
         <w:pStyle w:val="BodyText"/>
         <w:bidi w:val="0"/>
-        <w:spacing w:before="0" w:after="283"/>
+        <w:spacing w:lineRule="auto" w:line="276" w:before="0" w:after="140"/>
         <w:jc w:val="start"/>
         <w:rPr/>
       </w:pPr>
@@ -45,7 +908,7 @@
       <w:pPr>
         <w:pStyle w:val="BodyText"/>
         <w:bidi w:val="0"/>
-        <w:spacing w:before="0" w:after="283"/>
+        <w:spacing w:lineRule="auto" w:line="276" w:before="0" w:after="140"/>
         <w:jc w:val="start"/>
         <w:rPr/>
       </w:pPr>
@@ -58,7 +921,7 @@
       <w:pPr>
         <w:pStyle w:val="BodyText"/>
         <w:bidi w:val="0"/>
-        <w:spacing w:before="0" w:after="283"/>
+        <w:spacing w:lineRule="auto" w:line="276" w:before="0" w:after="140"/>
         <w:jc w:val="start"/>
         <w:rPr/>
       </w:pPr>
@@ -71,7 +934,7 @@
       <w:pPr>
         <w:pStyle w:val="BodyText"/>
         <w:bidi w:val="0"/>
-        <w:spacing w:before="0" w:after="283"/>
+        <w:spacing w:lineRule="auto" w:line="276" w:before="0" w:after="140"/>
         <w:jc w:val="start"/>
         <w:rPr/>
       </w:pPr>
@@ -84,7 +947,7 @@
       <w:pPr>
         <w:pStyle w:val="BodyText"/>
         <w:bidi w:val="0"/>
-        <w:spacing w:before="0" w:after="283"/>
+        <w:spacing w:lineRule="auto" w:line="276" w:before="0" w:after="140"/>
         <w:jc w:val="start"/>
         <w:rPr/>
       </w:pPr>
@@ -96,7 +959,12 @@
     <w:p>
       <w:pPr>
         <w:pStyle w:val="Heading1"/>
-        <w:bidi w:val="0"/>
+        <w:numPr>
+          <w:ilvl w:val="0"/>
+          <w:numId w:val="0"/>
+        </w:numPr>
+        <w:bidi w:val="0"/>
+        <w:spacing w:before="240" w:after="120"/>
         <w:jc w:val="start"/>
         <w:rPr/>
       </w:pPr>
@@ -109,7 +977,20 @@
       <w:pPr>
         <w:pStyle w:val="BodyText"/>
         <w:bidi w:val="0"/>
-        <w:spacing w:before="0" w:after="283"/>
+        <w:spacing w:lineRule="auto" w:line="276" w:before="0" w:after="140"/>
+        <w:jc w:val="start"/>
+        <w:rPr/>
+      </w:pPr>
+      <w:r>
+        <w:rPr/>
+        <w:t>Statement and Confirmation of Own Work</w:t>
+      </w:r>
+    </w:p>
+    <w:p>
+      <w:pPr>
+        <w:pStyle w:val="BodyText"/>
+        <w:bidi w:val="0"/>
+        <w:spacing w:lineRule="auto" w:line="276" w:before="0" w:after="140"/>
         <w:jc w:val="start"/>
         <w:rPr/>
       </w:pPr>
@@ -122,7 +1003,7 @@
       <w:pPr>
         <w:pStyle w:val="BodyText"/>
         <w:bidi w:val="0"/>
-        <w:spacing w:before="0" w:after="283"/>
+        <w:spacing w:lineRule="auto" w:line="276" w:before="0" w:after="140"/>
         <w:jc w:val="start"/>
         <w:rPr/>
       </w:pPr>
@@ -135,7 +1016,7 @@
       <w:pPr>
         <w:pStyle w:val="BodyText"/>
         <w:bidi w:val="0"/>
-        <w:spacing w:before="0" w:after="283"/>
+        <w:spacing w:lineRule="auto" w:line="276" w:before="0" w:after="140"/>
         <w:jc w:val="start"/>
         <w:rPr/>
       </w:pPr>
@@ -148,7 +1029,7 @@
       <w:pPr>
         <w:pStyle w:val="BodyText"/>
         <w:bidi w:val="0"/>
-        <w:spacing w:before="0" w:after="283"/>
+        <w:spacing w:lineRule="auto" w:line="276" w:before="0" w:after="140"/>
         <w:jc w:val="start"/>
         <w:rPr/>
       </w:pPr>
@@ -161,7 +1042,7 @@
       <w:pPr>
         <w:pStyle w:val="BodyText"/>
         <w:bidi w:val="0"/>
-        <w:spacing w:before="0" w:after="283"/>
+        <w:spacing w:lineRule="auto" w:line="276" w:before="0" w:after="140"/>
         <w:jc w:val="start"/>
         <w:rPr/>
       </w:pPr>
@@ -174,7 +1055,20 @@
       <w:pPr>
         <w:pStyle w:val="BodyText"/>
         <w:bidi w:val="0"/>
-        <w:spacing w:before="0" w:after="283"/>
+        <w:spacing w:lineRule="auto" w:line="276" w:before="0" w:after="140"/>
+        <w:jc w:val="start"/>
+        <w:rPr/>
+      </w:pPr>
+      <w:r>
+        <w:rPr/>
+        <w:t>Appendix C — Graphical interface shots</w:t>
+      </w:r>
+    </w:p>
+    <w:p>
+      <w:pPr>
+        <w:pStyle w:val="BodyText"/>
+        <w:bidi w:val="0"/>
+        <w:spacing w:lineRule="auto" w:line="276" w:before="0" w:after="140"/>
         <w:jc w:val="start"/>
         <w:rPr/>
       </w:pPr>
@@ -186,7 +1080,12 @@
     <w:p>
       <w:pPr>
         <w:pStyle w:val="Heading1"/>
-        <w:bidi w:val="0"/>
+        <w:numPr>
+          <w:ilvl w:val="0"/>
+          <w:numId w:val="0"/>
+        </w:numPr>
+        <w:bidi w:val="0"/>
+        <w:spacing w:before="240" w:after="120"/>
         <w:jc w:val="start"/>
         <w:rPr/>
       </w:pPr>
@@ -199,7 +1098,7 @@
       <w:pPr>
         <w:pStyle w:val="BodyText"/>
         <w:bidi w:val="0"/>
-        <w:spacing w:before="0" w:after="283"/>
+        <w:spacing w:lineRule="auto" w:line="276" w:before="0" w:after="140"/>
         <w:jc w:val="start"/>
         <w:rPr/>
       </w:pPr>
@@ -229,7 +1128,7 @@
       <w:pPr>
         <w:pStyle w:val="BodyText"/>
         <w:bidi w:val="0"/>
-        <w:spacing w:before="0" w:after="283"/>
+        <w:spacing w:lineRule="auto" w:line="276" w:before="0" w:after="140"/>
         <w:jc w:val="start"/>
         <w:rPr/>
       </w:pPr>
@@ -242,7 +1141,7 @@
       <w:pPr>
         <w:pStyle w:val="BodyText"/>
         <w:bidi w:val="0"/>
-        <w:spacing w:before="0" w:after="283"/>
+        <w:spacing w:lineRule="auto" w:line="276" w:before="0" w:after="140"/>
         <w:jc w:val="start"/>
         <w:rPr/>
       </w:pPr>
@@ -255,7 +1154,7 @@
       <w:pPr>
         <w:pStyle w:val="BodyText"/>
         <w:bidi w:val="0"/>
-        <w:spacing w:before="0" w:after="283"/>
+        <w:spacing w:lineRule="auto" w:line="276" w:before="0" w:after="140"/>
         <w:jc w:val="start"/>
         <w:rPr/>
       </w:pPr>
@@ -268,7 +1167,7 @@
       <w:pPr>
         <w:pStyle w:val="BodyText"/>
         <w:bidi w:val="0"/>
-        <w:spacing w:before="0" w:after="283"/>
+        <w:spacing w:lineRule="auto" w:line="276" w:before="0" w:after="140"/>
         <w:jc w:val="start"/>
         <w:rPr/>
       </w:pPr>
@@ -281,7 +1180,7 @@
       <w:pPr>
         <w:pStyle w:val="BodyText"/>
         <w:bidi w:val="0"/>
-        <w:spacing w:before="0" w:after="283"/>
+        <w:spacing w:lineRule="auto" w:line="276" w:before="0" w:after="140"/>
         <w:jc w:val="start"/>
         <w:rPr/>
       </w:pPr>
@@ -294,7 +1193,7 @@
       <w:pPr>
         <w:pStyle w:val="BodyText"/>
         <w:bidi w:val="0"/>
-        <w:spacing w:before="0" w:after="283"/>
+        <w:spacing w:lineRule="auto" w:line="276" w:before="0" w:after="140"/>
         <w:jc w:val="start"/>
         <w:rPr/>
       </w:pPr>
@@ -307,7 +1206,7 @@
       <w:pPr>
         <w:pStyle w:val="BodyText"/>
         <w:bidi w:val="0"/>
-        <w:spacing w:before="0" w:after="283"/>
+        <w:spacing w:lineRule="auto" w:line="276" w:before="0" w:after="140"/>
         <w:jc w:val="start"/>
         <w:rPr/>
       </w:pPr>
@@ -320,13 +1219,13 @@
       <w:pPr>
         <w:pStyle w:val="BodyText"/>
         <w:bidi w:val="0"/>
-        <w:spacing w:before="0" w:after="283"/>
-        <w:jc w:val="start"/>
-        <w:rPr/>
-      </w:pPr>
-      <w:r>
-        <w:rPr/>
-        <w:t>The attached script table supplies the repeatable actions. Expected results are not treated as executed results until a recorded run exists. The C# library was compiled and tested on this machine. The Windows Forms graphical interface was not executed here. That limit remains explicit.</w:t>
+        <w:spacing w:lineRule="auto" w:line="276" w:before="0" w:after="140"/>
+        <w:jc w:val="start"/>
+        <w:rPr/>
+      </w:pPr>
+      <w:r>
+        <w:rPr/>
+        <w:t>The attached script table supplies the repeatable actions. Expected results are not treated as executed results until a recorded run exists. The C# library was compiled and tested on this machine. Six xunit tests passed. A GTK host of the same form was then run on this Linux machine. Appendix C records that run. A Visual Studio run on Windows is still required before the USB is handed in.</w:t>
       </w:r>
     </w:p>
     <w:p>
@@ -350,7 +1249,7 @@
       <w:pPr>
         <w:pStyle w:val="BodyText"/>
         <w:bidi w:val="0"/>
-        <w:spacing w:before="0" w:after="283"/>
+        <w:spacing w:lineRule="auto" w:line="276" w:before="0" w:after="140"/>
         <w:jc w:val="start"/>
         <w:rPr/>
       </w:pPr>
@@ -363,7 +1262,7 @@
       <w:pPr>
         <w:pStyle w:val="BodyText"/>
         <w:bidi w:val="0"/>
-        <w:spacing w:before="0" w:after="283"/>
+        <w:spacing w:lineRule="auto" w:line="276" w:before="0" w:after="140"/>
         <w:jc w:val="start"/>
         <w:rPr/>
       </w:pPr>
@@ -376,7 +1275,7 @@
       <w:pPr>
         <w:pStyle w:val="BodyText"/>
         <w:bidi w:val="0"/>
-        <w:spacing w:before="0" w:after="283"/>
+        <w:spacing w:lineRule="auto" w:line="276" w:before="0" w:after="140"/>
         <w:jc w:val="start"/>
         <w:rPr/>
       </w:pPr>
@@ -389,7 +1288,7 @@
       <w:pPr>
         <w:pStyle w:val="BodyText"/>
         <w:bidi w:val="0"/>
-        <w:spacing w:before="0" w:after="283"/>
+        <w:spacing w:lineRule="auto" w:line="276" w:before="0" w:after="140"/>
         <w:jc w:val="start"/>
         <w:rPr/>
       </w:pPr>
@@ -402,7 +1301,7 @@
       <w:pPr>
         <w:pStyle w:val="BodyText"/>
         <w:bidi w:val="0"/>
-        <w:spacing w:before="0" w:after="283"/>
+        <w:spacing w:lineRule="auto" w:line="276" w:before="0" w:after="140"/>
         <w:jc w:val="start"/>
         <w:rPr/>
       </w:pPr>
@@ -415,7 +1314,7 @@
       <w:pPr>
         <w:pStyle w:val="BodyText"/>
         <w:bidi w:val="0"/>
-        <w:spacing w:before="0" w:after="283"/>
+        <w:spacing w:lineRule="auto" w:line="276" w:before="0" w:after="140"/>
         <w:jc w:val="start"/>
         <w:rPr/>
       </w:pPr>
@@ -428,7 +1327,7 @@
       <w:pPr>
         <w:pStyle w:val="BodyText"/>
         <w:bidi w:val="0"/>
-        <w:spacing w:before="0" w:after="283"/>
+        <w:spacing w:lineRule="auto" w:line="276" w:before="0" w:after="140"/>
         <w:jc w:val="start"/>
         <w:rPr/>
       </w:pPr>
@@ -441,7 +1340,7 @@
       <w:pPr>
         <w:pStyle w:val="BodyText"/>
         <w:bidi w:val="0"/>
-        <w:spacing w:before="0" w:after="283"/>
+        <w:spacing w:lineRule="auto" w:line="276" w:before="0" w:after="140"/>
         <w:jc w:val="start"/>
         <w:rPr/>
       </w:pPr>
@@ -457,13 +1356,18 @@
       </w:r>
       <w:r>
         <w:rPr/>
-        <w:t xml:space="preserve"> on the class library. Six tests passed and none failed. The oracle wrote evidence/oracle.json. The WinForms project was not started. Untested graphical clicks therefore remain untested. That makes the evidence useful to another reviewer.</w:t>
+        <w:t xml:space="preserve"> on the class library. Six tests passed and none failed. The oracle wrote evidence/oracle.json. The same form was then opened through a GTK host on this Linux machine. Figure 4 shows a short password rejected. Figure 5 shows a valid account created. Figure 7 shows Walking 4000 steps, 3 km and 30 minutes producing 141.75 calories against a goal of 100. A Windows Visual Studio run is still outstanding.</w:t>
       </w:r>
     </w:p>
     <w:p>
       <w:pPr>
         <w:pStyle w:val="Heading1"/>
-        <w:bidi w:val="0"/>
+        <w:numPr>
+          <w:ilvl w:val="0"/>
+          <w:numId w:val="0"/>
+        </w:numPr>
+        <w:bidi w:val="0"/>
+        <w:spacing w:before="240" w:after="120"/>
         <w:jc w:val="start"/>
         <w:rPr/>
       </w:pPr>
@@ -476,7 +1380,7 @@
       <w:pPr>
         <w:pStyle w:val="BodyText"/>
         <w:bidi w:val="0"/>
-        <w:spacing w:before="0" w:after="283"/>
+        <w:spacing w:lineRule="auto" w:line="276" w:before="0" w:after="140"/>
         <w:jc w:val="start"/>
         <w:rPr/>
       </w:pPr>
@@ -506,7 +1410,7 @@
       <w:pPr>
         <w:pStyle w:val="BodyText"/>
         <w:bidi w:val="0"/>
-        <w:spacing w:before="0" w:after="283"/>
+        <w:spacing w:lineRule="auto" w:line="276" w:before="0" w:after="140"/>
         <w:jc w:val="start"/>
         <w:rPr/>
       </w:pPr>
@@ -519,7 +1423,7 @@
       <w:pPr>
         <w:pStyle w:val="BodyText"/>
         <w:bidi w:val="0"/>
-        <w:spacing w:before="0" w:after="283"/>
+        <w:spacing w:lineRule="auto" w:line="276" w:before="0" w:after="140"/>
         <w:jc w:val="start"/>
         <w:rPr/>
       </w:pPr>
@@ -532,7 +1436,7 @@
       <w:pPr>
         <w:pStyle w:val="BodyText"/>
         <w:bidi w:val="0"/>
-        <w:spacing w:before="0" w:after="283"/>
+        <w:spacing w:lineRule="auto" w:line="276" w:before="0" w:after="140"/>
         <w:jc w:val="start"/>
         <w:rPr/>
       </w:pPr>
@@ -545,7 +1449,7 @@
       <w:pPr>
         <w:pStyle w:val="BodyText"/>
         <w:bidi w:val="0"/>
-        <w:spacing w:before="0" w:after="283"/>
+        <w:spacing w:lineRule="auto" w:line="276" w:before="0" w:after="140"/>
         <w:jc w:val="start"/>
         <w:rPr/>
       </w:pPr>
@@ -558,7 +1462,7 @@
       <w:pPr>
         <w:pStyle w:val="BodyText"/>
         <w:bidi w:val="0"/>
-        <w:spacing w:before="0" w:after="283"/>
+        <w:spacing w:lineRule="auto" w:line="276" w:before="0" w:after="140"/>
         <w:jc w:val="start"/>
         <w:rPr/>
       </w:pPr>
@@ -571,7 +1475,7 @@
       <w:pPr>
         <w:pStyle w:val="BodyText"/>
         <w:bidi w:val="0"/>
-        <w:spacing w:before="0" w:after="283"/>
+        <w:spacing w:lineRule="auto" w:line="276" w:before="0" w:after="140"/>
         <w:jc w:val="start"/>
         <w:rPr/>
       </w:pPr>
@@ -584,7 +1488,7 @@
       <w:pPr>
         <w:pStyle w:val="BodyText"/>
         <w:bidi w:val="0"/>
-        <w:spacing w:before="0" w:after="283"/>
+        <w:spacing w:lineRule="auto" w:line="276" w:before="0" w:after="140"/>
         <w:jc w:val="start"/>
         <w:rPr/>
       </w:pPr>
@@ -597,7 +1501,7 @@
       <w:pPr>
         <w:pStyle w:val="BodyText"/>
         <w:bidi w:val="0"/>
-        <w:spacing w:before="0" w:after="283"/>
+        <w:spacing w:lineRule="auto" w:line="276" w:before="0" w:after="140"/>
         <w:jc w:val="start"/>
         <w:rPr/>
       </w:pPr>
@@ -610,7 +1514,7 @@
       <w:pPr>
         <w:pStyle w:val="BodyText"/>
         <w:bidi w:val="0"/>
-        <w:spacing w:before="0" w:after="283"/>
+        <w:spacing w:lineRule="auto" w:line="276" w:before="0" w:after="140"/>
         <w:jc w:val="start"/>
         <w:rPr/>
       </w:pPr>
@@ -622,7 +1526,12 @@
     <w:p>
       <w:pPr>
         <w:pStyle w:val="Heading1"/>
-        <w:bidi w:val="0"/>
+        <w:numPr>
+          <w:ilvl w:val="0"/>
+          <w:numId w:val="0"/>
+        </w:numPr>
+        <w:bidi w:val="0"/>
+        <w:spacing w:before="240" w:after="120"/>
         <w:jc w:val="start"/>
         <w:rPr/>
       </w:pPr>
@@ -635,7 +1544,7 @@
       <w:pPr>
         <w:pStyle w:val="BodyText"/>
         <w:bidi w:val="0"/>
-        <w:spacing w:before="0" w:after="283"/>
+        <w:spacing w:lineRule="auto" w:line="276" w:before="0" w:after="140"/>
         <w:jc w:val="start"/>
         <w:rPr/>
       </w:pPr>
@@ -643,9 +1552,9 @@
         <w:rPr/>
         <w:drawing>
           <wp:inline distT="0" distB="0" distL="0" distR="0">
-            <wp:extent cx="720090" cy="360045"/>
+            <wp:extent cx="11430000" cy="8572500"/>
             <wp:effectExtent l="0" t="0" r="0" b="0"/>
-            <wp:docPr id="1" name="Image1" title="Hand-drawn class diagram of the fitness tracker"/>
+            <wp:docPr id="3" name="Image1" title="Hand-drawn class diagram of the fitness tracker"/>
             <wp:cNvGraphicFramePr>
               <a:graphicFrameLocks xmlns:a="http://schemas.openxmlformats.org/drawingml/2006/main" noChangeAspect="1"/>
             </wp:cNvGraphicFramePr>
@@ -653,13 +1562,13 @@
               <a:graphicData uri="http://schemas.openxmlformats.org/drawingml/2006/picture">
                 <pic:pic xmlns:pic="http://schemas.openxmlformats.org/drawingml/2006/picture">
                   <pic:nvPicPr>
-                    <pic:cNvPr id="1" name="Image1" title="Hand-drawn class diagram of the fitness tracker"/>
+                    <pic:cNvPr id="3" name="Image1" title="Hand-drawn class diagram of the fitness tracker"/>
                     <pic:cNvPicPr>
                       <a:picLocks noChangeAspect="1" noChangeArrowheads="1"/>
                     </pic:cNvPicPr>
                   </pic:nvPicPr>
                   <pic:blipFill>
-                    <a:blip r:link="rId2"/>
+                    <a:blip r:embed="rId5"/>
                     <a:stretch>
                       <a:fillRect/>
                     </a:stretch>
@@ -667,7 +1576,7 @@
                   <pic:spPr bwMode="auto">
                     <a:xfrm>
                       <a:off x="0" y="0"/>
-                      <a:ext cx="720090" cy="360045"/>
+                      <a:ext cx="11430000" cy="8572500"/>
                     </a:xfrm>
                     <a:prstGeom prst="rect">
                       <a:avLst/>
@@ -692,7 +1601,12 @@
     <w:p>
       <w:pPr>
         <w:pStyle w:val="Heading1"/>
-        <w:bidi w:val="0"/>
+        <w:numPr>
+          <w:ilvl w:val="0"/>
+          <w:numId w:val="0"/>
+        </w:numPr>
+        <w:bidi w:val="0"/>
+        <w:spacing w:before="240" w:after="120"/>
         <w:jc w:val="start"/>
         <w:rPr/>
       </w:pPr>
@@ -705,7 +1619,7 @@
       <w:pPr>
         <w:pStyle w:val="BodyText"/>
         <w:bidi w:val="0"/>
-        <w:spacing w:before="0" w:after="283"/>
+        <w:spacing w:lineRule="auto" w:line="276" w:before="0" w:after="140"/>
         <w:jc w:val="start"/>
         <w:rPr/>
       </w:pPr>
@@ -762,7 +1676,6 @@
               <w:pStyle w:val="TableHeading"/>
               <w:suppressLineNumbers/>
               <w:bidi w:val="0"/>
-              <w:spacing w:before="0" w:after="283"/>
               <w:jc w:val="center"/>
               <w:rPr/>
             </w:pPr>
@@ -783,7 +1696,6 @@
               <w:pStyle w:val="TableHeading"/>
               <w:suppressLineNumbers/>
               <w:bidi w:val="0"/>
-              <w:spacing w:before="0" w:after="283"/>
               <w:jc w:val="center"/>
               <w:rPr/>
             </w:pPr>
@@ -804,7 +1716,6 @@
               <w:pStyle w:val="TableHeading"/>
               <w:suppressLineNumbers/>
               <w:bidi w:val="0"/>
-              <w:spacing w:before="0" w:after="283"/>
               <w:jc w:val="center"/>
               <w:rPr/>
             </w:pPr>
@@ -825,7 +1736,6 @@
               <w:pStyle w:val="TableHeading"/>
               <w:suppressLineNumbers/>
               <w:bidi w:val="0"/>
-              <w:spacing w:before="0" w:after="283"/>
               <w:jc w:val="center"/>
               <w:rPr/>
             </w:pPr>
@@ -846,7 +1756,6 @@
               <w:pStyle w:val="TableHeading"/>
               <w:suppressLineNumbers/>
               <w:bidi w:val="0"/>
-              <w:spacing w:before="0" w:after="283"/>
               <w:jc w:val="center"/>
               <w:rPr/>
             </w:pPr>
@@ -868,8 +1777,9 @@
           <w:p>
             <w:pPr>
               <w:pStyle w:val="TableContents"/>
-              <w:bidi w:val="0"/>
-              <w:spacing w:before="0" w:after="283"/>
+              <w:widowControl w:val="false"/>
+              <w:suppressLineNumbers/>
+              <w:bidi w:val="0"/>
               <w:jc w:val="start"/>
               <w:rPr/>
             </w:pPr>
@@ -888,8 +1798,9 @@
           <w:p>
             <w:pPr>
               <w:pStyle w:val="TableContents"/>
-              <w:bidi w:val="0"/>
-              <w:spacing w:before="0" w:after="283"/>
+              <w:widowControl w:val="false"/>
+              <w:suppressLineNumbers/>
+              <w:bidi w:val="0"/>
               <w:jc w:val="start"/>
               <w:rPr/>
             </w:pPr>
@@ -908,8 +1819,9 @@
           <w:p>
             <w:pPr>
               <w:pStyle w:val="TableContents"/>
-              <w:bidi w:val="0"/>
-              <w:spacing w:before="0" w:after="283"/>
+              <w:widowControl w:val="false"/>
+              <w:suppressLineNumbers/>
+              <w:bidi w:val="0"/>
               <w:jc w:val="start"/>
               <w:rPr/>
             </w:pPr>
@@ -928,8 +1840,9 @@
           <w:p>
             <w:pPr>
               <w:pStyle w:val="TableContents"/>
-              <w:bidi w:val="0"/>
-              <w:spacing w:before="0" w:after="283"/>
+              <w:widowControl w:val="false"/>
+              <w:suppressLineNumbers/>
+              <w:bidi w:val="0"/>
               <w:jc w:val="start"/>
               <w:rPr/>
             </w:pPr>
@@ -948,8 +1861,9 @@
           <w:p>
             <w:pPr>
               <w:pStyle w:val="TableContents"/>
-              <w:bidi w:val="0"/>
-              <w:spacing w:before="0" w:after="283"/>
+              <w:widowControl w:val="false"/>
+              <w:suppressLineNumbers/>
+              <w:bidi w:val="0"/>
               <w:jc w:val="start"/>
               <w:rPr/>
             </w:pPr>
@@ -971,8 +1885,9 @@
           <w:p>
             <w:pPr>
               <w:pStyle w:val="TableContents"/>
-              <w:bidi w:val="0"/>
-              <w:spacing w:before="0" w:after="283"/>
+              <w:widowControl w:val="false"/>
+              <w:suppressLineNumbers/>
+              <w:bidi w:val="0"/>
               <w:jc w:val="start"/>
               <w:rPr/>
             </w:pPr>
@@ -991,8 +1906,9 @@
           <w:p>
             <w:pPr>
               <w:pStyle w:val="TableContents"/>
-              <w:bidi w:val="0"/>
-              <w:spacing w:before="0" w:after="283"/>
+              <w:widowControl w:val="false"/>
+              <w:suppressLineNumbers/>
+              <w:bidi w:val="0"/>
               <w:jc w:val="start"/>
               <w:rPr/>
             </w:pPr>
@@ -1011,8 +1927,9 @@
           <w:p>
             <w:pPr>
               <w:pStyle w:val="TableContents"/>
-              <w:bidi w:val="0"/>
-              <w:spacing w:before="0" w:after="283"/>
+              <w:widowControl w:val="false"/>
+              <w:suppressLineNumbers/>
+              <w:bidi w:val="0"/>
               <w:jc w:val="start"/>
               <w:rPr/>
             </w:pPr>
@@ -1031,8 +1948,9 @@
           <w:p>
             <w:pPr>
               <w:pStyle w:val="TableContents"/>
-              <w:bidi w:val="0"/>
-              <w:spacing w:before="0" w:after="283"/>
+              <w:widowControl w:val="false"/>
+              <w:suppressLineNumbers/>
+              <w:bidi w:val="0"/>
               <w:jc w:val="start"/>
               <w:rPr/>
             </w:pPr>
@@ -1051,8 +1969,9 @@
           <w:p>
             <w:pPr>
               <w:pStyle w:val="TableContents"/>
-              <w:bidi w:val="0"/>
-              <w:spacing w:before="0" w:after="283"/>
+              <w:widowControl w:val="false"/>
+              <w:suppressLineNumbers/>
+              <w:bidi w:val="0"/>
               <w:jc w:val="start"/>
               <w:rPr/>
             </w:pPr>
@@ -1074,8 +1993,9 @@
           <w:p>
             <w:pPr>
               <w:pStyle w:val="TableContents"/>
-              <w:bidi w:val="0"/>
-              <w:spacing w:before="0" w:after="283"/>
+              <w:widowControl w:val="false"/>
+              <w:suppressLineNumbers/>
+              <w:bidi w:val="0"/>
               <w:jc w:val="start"/>
               <w:rPr/>
             </w:pPr>
@@ -1094,8 +2014,9 @@
           <w:p>
             <w:pPr>
               <w:pStyle w:val="TableContents"/>
-              <w:bidi w:val="0"/>
-              <w:spacing w:before="0" w:after="283"/>
+              <w:widowControl w:val="false"/>
+              <w:suppressLineNumbers/>
+              <w:bidi w:val="0"/>
               <w:jc w:val="start"/>
               <w:rPr/>
             </w:pPr>
@@ -1114,8 +2035,9 @@
           <w:p>
             <w:pPr>
               <w:pStyle w:val="TableContents"/>
-              <w:bidi w:val="0"/>
-              <w:spacing w:before="0" w:after="283"/>
+              <w:widowControl w:val="false"/>
+              <w:suppressLineNumbers/>
+              <w:bidi w:val="0"/>
               <w:jc w:val="start"/>
               <w:rPr/>
             </w:pPr>
@@ -1134,8 +2056,9 @@
           <w:p>
             <w:pPr>
               <w:pStyle w:val="TableContents"/>
-              <w:bidi w:val="0"/>
-              <w:spacing w:before="0" w:after="283"/>
+              <w:widowControl w:val="false"/>
+              <w:suppressLineNumbers/>
+              <w:bidi w:val="0"/>
               <w:jc w:val="start"/>
               <w:rPr/>
             </w:pPr>
@@ -1154,8 +2077,9 @@
           <w:p>
             <w:pPr>
               <w:pStyle w:val="TableContents"/>
-              <w:bidi w:val="0"/>
-              <w:spacing w:before="0" w:after="283"/>
+              <w:widowControl w:val="false"/>
+              <w:suppressLineNumbers/>
+              <w:bidi w:val="0"/>
               <w:jc w:val="start"/>
               <w:rPr/>
             </w:pPr>
@@ -1177,8 +2101,9 @@
           <w:p>
             <w:pPr>
               <w:pStyle w:val="TableContents"/>
-              <w:bidi w:val="0"/>
-              <w:spacing w:before="0" w:after="283"/>
+              <w:widowControl w:val="false"/>
+              <w:suppressLineNumbers/>
+              <w:bidi w:val="0"/>
               <w:jc w:val="start"/>
               <w:rPr/>
             </w:pPr>
@@ -1197,8 +2122,9 @@
           <w:p>
             <w:pPr>
               <w:pStyle w:val="TableContents"/>
-              <w:bidi w:val="0"/>
-              <w:spacing w:before="0" w:after="283"/>
+              <w:widowControl w:val="false"/>
+              <w:suppressLineNumbers/>
+              <w:bidi w:val="0"/>
               <w:jc w:val="start"/>
               <w:rPr/>
             </w:pPr>
@@ -1217,8 +2143,9 @@
           <w:p>
             <w:pPr>
               <w:pStyle w:val="TableContents"/>
-              <w:bidi w:val="0"/>
-              <w:spacing w:before="0" w:after="283"/>
+              <w:widowControl w:val="false"/>
+              <w:suppressLineNumbers/>
+              <w:bidi w:val="0"/>
               <w:jc w:val="start"/>
               <w:rPr/>
             </w:pPr>
@@ -1237,8 +2164,9 @@
           <w:p>
             <w:pPr>
               <w:pStyle w:val="TableContents"/>
-              <w:bidi w:val="0"/>
-              <w:spacing w:before="0" w:after="283"/>
+              <w:widowControl w:val="false"/>
+              <w:suppressLineNumbers/>
+              <w:bidi w:val="0"/>
               <w:jc w:val="start"/>
               <w:rPr/>
             </w:pPr>
@@ -1257,8 +2185,9 @@
           <w:p>
             <w:pPr>
               <w:pStyle w:val="TableContents"/>
-              <w:bidi w:val="0"/>
-              <w:spacing w:before="0" w:after="283"/>
+              <w:widowControl w:val="false"/>
+              <w:suppressLineNumbers/>
+              <w:bidi w:val="0"/>
               <w:jc w:val="start"/>
               <w:rPr/>
             </w:pPr>
@@ -1280,8 +2209,9 @@
           <w:p>
             <w:pPr>
               <w:pStyle w:val="TableContents"/>
-              <w:bidi w:val="0"/>
-              <w:spacing w:before="0" w:after="283"/>
+              <w:widowControl w:val="false"/>
+              <w:suppressLineNumbers/>
+              <w:bidi w:val="0"/>
               <w:jc w:val="start"/>
               <w:rPr/>
             </w:pPr>
@@ -1300,8 +2230,9 @@
           <w:p>
             <w:pPr>
               <w:pStyle w:val="TableContents"/>
-              <w:bidi w:val="0"/>
-              <w:spacing w:before="0" w:after="283"/>
+              <w:widowControl w:val="false"/>
+              <w:suppressLineNumbers/>
+              <w:bidi w:val="0"/>
               <w:jc w:val="start"/>
               <w:rPr/>
             </w:pPr>
@@ -1320,8 +2251,9 @@
           <w:p>
             <w:pPr>
               <w:pStyle w:val="TableContents"/>
-              <w:bidi w:val="0"/>
-              <w:spacing w:before="0" w:after="283"/>
+              <w:widowControl w:val="false"/>
+              <w:suppressLineNumbers/>
+              <w:bidi w:val="0"/>
               <w:jc w:val="start"/>
               <w:rPr/>
             </w:pPr>
@@ -1340,8 +2272,9 @@
           <w:p>
             <w:pPr>
               <w:pStyle w:val="TableContents"/>
-              <w:bidi w:val="0"/>
-              <w:spacing w:before="0" w:after="283"/>
+              <w:widowControl w:val="false"/>
+              <w:suppressLineNumbers/>
+              <w:bidi w:val="0"/>
               <w:jc w:val="start"/>
               <w:rPr/>
             </w:pPr>
@@ -1360,8 +2293,9 @@
           <w:p>
             <w:pPr>
               <w:pStyle w:val="TableContents"/>
-              <w:bidi w:val="0"/>
-              <w:spacing w:before="0" w:after="283"/>
+              <w:widowControl w:val="false"/>
+              <w:suppressLineNumbers/>
+              <w:bidi w:val="0"/>
               <w:jc w:val="start"/>
               <w:rPr/>
             </w:pPr>
@@ -1383,8 +2317,9 @@
           <w:p>
             <w:pPr>
               <w:pStyle w:val="TableContents"/>
-              <w:bidi w:val="0"/>
-              <w:spacing w:before="0" w:after="283"/>
+              <w:widowControl w:val="false"/>
+              <w:suppressLineNumbers/>
+              <w:bidi w:val="0"/>
               <w:jc w:val="start"/>
               <w:rPr/>
             </w:pPr>
@@ -1403,8 +2338,9 @@
           <w:p>
             <w:pPr>
               <w:pStyle w:val="TableContents"/>
-              <w:bidi w:val="0"/>
-              <w:spacing w:before="0" w:after="283"/>
+              <w:widowControl w:val="false"/>
+              <w:suppressLineNumbers/>
+              <w:bidi w:val="0"/>
               <w:jc w:val="start"/>
               <w:rPr/>
             </w:pPr>
@@ -1423,8 +2359,9 @@
           <w:p>
             <w:pPr>
               <w:pStyle w:val="TableContents"/>
-              <w:bidi w:val="0"/>
-              <w:spacing w:before="0" w:after="283"/>
+              <w:widowControl w:val="false"/>
+              <w:suppressLineNumbers/>
+              <w:bidi w:val="0"/>
               <w:jc w:val="start"/>
               <w:rPr/>
             </w:pPr>
@@ -1443,8 +2380,9 @@
           <w:p>
             <w:pPr>
               <w:pStyle w:val="TableContents"/>
-              <w:bidi w:val="0"/>
-              <w:spacing w:before="0" w:after="283"/>
+              <w:widowControl w:val="false"/>
+              <w:suppressLineNumbers/>
+              <w:bidi w:val="0"/>
               <w:jc w:val="start"/>
               <w:rPr/>
             </w:pPr>
@@ -1463,8 +2401,9 @@
           <w:p>
             <w:pPr>
               <w:pStyle w:val="TableContents"/>
-              <w:bidi w:val="0"/>
-              <w:spacing w:before="0" w:after="283"/>
+              <w:widowControl w:val="false"/>
+              <w:suppressLineNumbers/>
+              <w:bidi w:val="0"/>
               <w:jc w:val="start"/>
               <w:rPr/>
             </w:pPr>
@@ -1491,7 +2430,7 @@
     </w:p>
     <w:tbl>
       <w:tblPr>
-        <w:tblW w:w="8114" w:type="dxa"/>
+        <w:tblW w:w="9689" w:type="dxa"/>
         <w:jc w:val="start"/>
         <w:tblInd w:w="0" w:type="dxa"/>
         <w:tblLayout w:type="fixed"/>
@@ -1504,9 +2443,9 @@
       </w:tblPr>
       <w:tblGrid>
         <w:gridCol w:w="658"/>
-        <w:gridCol w:w="3889"/>
-        <w:gridCol w:w="2679"/>
-        <w:gridCol w:w="888"/>
+        <w:gridCol w:w="4191"/>
+        <w:gridCol w:w="3168"/>
+        <w:gridCol w:w="1672"/>
       </w:tblGrid>
       <w:tr>
         <w:trPr>
@@ -1523,7 +2462,6 @@
               <w:pStyle w:val="TableHeading"/>
               <w:suppressLineNumbers/>
               <w:bidi w:val="0"/>
-              <w:spacing w:before="0" w:after="283"/>
               <w:jc w:val="center"/>
               <w:rPr/>
             </w:pPr>
@@ -1535,7 +2473,7 @@
         </w:tc>
         <w:tc>
           <w:tcPr>
-            <w:tcW w:w="3889" w:type="dxa"/>
+            <w:tcW w:w="4191" w:type="dxa"/>
             <w:tcBorders/>
             <w:vAlign w:val="center"/>
           </w:tcPr>
@@ -1544,7 +2482,6 @@
               <w:pStyle w:val="TableHeading"/>
               <w:suppressLineNumbers/>
               <w:bidi w:val="0"/>
-              <w:spacing w:before="0" w:after="283"/>
               <w:jc w:val="center"/>
               <w:rPr/>
             </w:pPr>
@@ -1556,7 +2493,7 @@
         </w:tc>
         <w:tc>
           <w:tcPr>
-            <w:tcW w:w="2679" w:type="dxa"/>
+            <w:tcW w:w="3168" w:type="dxa"/>
             <w:tcBorders/>
             <w:vAlign w:val="center"/>
           </w:tcPr>
@@ -1565,7 +2502,6 @@
               <w:pStyle w:val="TableHeading"/>
               <w:suppressLineNumbers/>
               <w:bidi w:val="0"/>
-              <w:spacing w:before="0" w:after="283"/>
               <w:jc w:val="center"/>
               <w:rPr/>
             </w:pPr>
@@ -1577,7 +2513,7 @@
         </w:tc>
         <w:tc>
           <w:tcPr>
-            <w:tcW w:w="888" w:type="dxa"/>
+            <w:tcW w:w="1672" w:type="dxa"/>
             <w:tcBorders/>
             <w:vAlign w:val="center"/>
           </w:tcPr>
@@ -1586,7 +2522,6 @@
               <w:pStyle w:val="TableHeading"/>
               <w:suppressLineNumbers/>
               <w:bidi w:val="0"/>
-              <w:spacing w:before="0" w:after="283"/>
               <w:jc w:val="center"/>
               <w:rPr/>
             </w:pPr>
@@ -1608,8 +2543,9 @@
           <w:p>
             <w:pPr>
               <w:pStyle w:val="TableContents"/>
-              <w:bidi w:val="0"/>
-              <w:spacing w:before="0" w:after="283"/>
+              <w:widowControl w:val="false"/>
+              <w:suppressLineNumbers/>
+              <w:bidi w:val="0"/>
               <w:jc w:val="start"/>
               <w:rPr/>
             </w:pPr>
@@ -1621,15 +2557,16 @@
         </w:tc>
         <w:tc>
           <w:tcPr>
-            <w:tcW w:w="3889" w:type="dxa"/>
-            <w:tcBorders/>
-            <w:vAlign w:val="center"/>
-          </w:tcPr>
-          <w:p>
-            <w:pPr>
-              <w:pStyle w:val="TableContents"/>
-              <w:bidi w:val="0"/>
-              <w:spacing w:before="0" w:after="283"/>
+            <w:tcW w:w="4191" w:type="dxa"/>
+            <w:tcBorders/>
+            <w:vAlign w:val="center"/>
+          </w:tcPr>
+          <w:p>
+            <w:pPr>
+              <w:pStyle w:val="TableContents"/>
+              <w:widowControl w:val="false"/>
+              <w:suppressLineNumbers/>
+              <w:bidi w:val="0"/>
               <w:jc w:val="start"/>
               <w:rPr/>
             </w:pPr>
@@ -1641,15 +2578,16 @@
         </w:tc>
         <w:tc>
           <w:tcPr>
-            <w:tcW w:w="2679" w:type="dxa"/>
-            <w:tcBorders/>
-            <w:vAlign w:val="center"/>
-          </w:tcPr>
-          <w:p>
-            <w:pPr>
-              <w:pStyle w:val="TableContents"/>
-              <w:bidi w:val="0"/>
-              <w:spacing w:before="0" w:after="283"/>
+            <w:tcW w:w="3168" w:type="dxa"/>
+            <w:tcBorders/>
+            <w:vAlign w:val="center"/>
+          </w:tcPr>
+          <w:p>
+            <w:pPr>
+              <w:pStyle w:val="TableContents"/>
+              <w:widowControl w:val="false"/>
+              <w:suppressLineNumbers/>
+              <w:bidi w:val="0"/>
               <w:jc w:val="start"/>
               <w:rPr/>
             </w:pPr>
@@ -1661,15 +2599,16 @@
         </w:tc>
         <w:tc>
           <w:tcPr>
-            <w:tcW w:w="888" w:type="dxa"/>
-            <w:tcBorders/>
-            <w:vAlign w:val="center"/>
-          </w:tcPr>
-          <w:p>
-            <w:pPr>
-              <w:pStyle w:val="TableContents"/>
-              <w:bidi w:val="0"/>
-              <w:spacing w:before="0" w:after="283"/>
+            <w:tcW w:w="1672" w:type="dxa"/>
+            <w:tcBorders/>
+            <w:vAlign w:val="center"/>
+          </w:tcPr>
+          <w:p>
+            <w:pPr>
+              <w:pStyle w:val="TableContents"/>
+              <w:widowControl w:val="false"/>
+              <w:suppressLineNumbers/>
+              <w:bidi w:val="0"/>
               <w:jc w:val="start"/>
               <w:rPr/>
             </w:pPr>
@@ -1691,8 +2630,9 @@
           <w:p>
             <w:pPr>
               <w:pStyle w:val="TableContents"/>
-              <w:bidi w:val="0"/>
-              <w:spacing w:before="0" w:after="283"/>
+              <w:widowControl w:val="false"/>
+              <w:suppressLineNumbers/>
+              <w:bidi w:val="0"/>
               <w:jc w:val="start"/>
               <w:rPr/>
             </w:pPr>
@@ -1704,15 +2644,16 @@
         </w:tc>
         <w:tc>
           <w:tcPr>
-            <w:tcW w:w="3889" w:type="dxa"/>
-            <w:tcBorders/>
-            <w:vAlign w:val="center"/>
-          </w:tcPr>
-          <w:p>
-            <w:pPr>
-              <w:pStyle w:val="TableContents"/>
-              <w:bidi w:val="0"/>
-              <w:spacing w:before="0" w:after="283"/>
+            <w:tcW w:w="4191" w:type="dxa"/>
+            <w:tcBorders/>
+            <w:vAlign w:val="center"/>
+          </w:tcPr>
+          <w:p>
+            <w:pPr>
+              <w:pStyle w:val="TableContents"/>
+              <w:widowControl w:val="false"/>
+              <w:suppressLineNumbers/>
+              <w:bidi w:val="0"/>
               <w:jc w:val="start"/>
               <w:rPr/>
             </w:pPr>
@@ -1724,15 +2665,16 @@
         </w:tc>
         <w:tc>
           <w:tcPr>
-            <w:tcW w:w="2679" w:type="dxa"/>
-            <w:tcBorders/>
-            <w:vAlign w:val="center"/>
-          </w:tcPr>
-          <w:p>
-            <w:pPr>
-              <w:pStyle w:val="TableContents"/>
-              <w:bidi w:val="0"/>
-              <w:spacing w:before="0" w:after="283"/>
+            <w:tcW w:w="3168" w:type="dxa"/>
+            <w:tcBorders/>
+            <w:vAlign w:val="center"/>
+          </w:tcPr>
+          <w:p>
+            <w:pPr>
+              <w:pStyle w:val="TableContents"/>
+              <w:widowControl w:val="false"/>
+              <w:suppressLineNumbers/>
+              <w:bidi w:val="0"/>
               <w:jc w:val="start"/>
               <w:rPr/>
             </w:pPr>
@@ -1744,15 +2686,16 @@
         </w:tc>
         <w:tc>
           <w:tcPr>
-            <w:tcW w:w="888" w:type="dxa"/>
-            <w:tcBorders/>
-            <w:vAlign w:val="center"/>
-          </w:tcPr>
-          <w:p>
-            <w:pPr>
-              <w:pStyle w:val="TableContents"/>
-              <w:bidi w:val="0"/>
-              <w:spacing w:before="0" w:after="283"/>
+            <w:tcW w:w="1672" w:type="dxa"/>
+            <w:tcBorders/>
+            <w:vAlign w:val="center"/>
+          </w:tcPr>
+          <w:p>
+            <w:pPr>
+              <w:pStyle w:val="TableContents"/>
+              <w:widowControl w:val="false"/>
+              <w:suppressLineNumbers/>
+              <w:bidi w:val="0"/>
               <w:jc w:val="start"/>
               <w:rPr/>
             </w:pPr>
@@ -1774,8 +2717,9 @@
           <w:p>
             <w:pPr>
               <w:pStyle w:val="TableContents"/>
-              <w:bidi w:val="0"/>
-              <w:spacing w:before="0" w:after="283"/>
+              <w:widowControl w:val="false"/>
+              <w:suppressLineNumbers/>
+              <w:bidi w:val="0"/>
               <w:jc w:val="start"/>
               <w:rPr/>
             </w:pPr>
@@ -1787,15 +2731,16 @@
         </w:tc>
         <w:tc>
           <w:tcPr>
-            <w:tcW w:w="3889" w:type="dxa"/>
-            <w:tcBorders/>
-            <w:vAlign w:val="center"/>
-          </w:tcPr>
-          <w:p>
-            <w:pPr>
-              <w:pStyle w:val="TableContents"/>
-              <w:bidi w:val="0"/>
-              <w:spacing w:before="0" w:after="283"/>
+            <w:tcW w:w="4191" w:type="dxa"/>
+            <w:tcBorders/>
+            <w:vAlign w:val="center"/>
+          </w:tcPr>
+          <w:p>
+            <w:pPr>
+              <w:pStyle w:val="TableContents"/>
+              <w:widowControl w:val="false"/>
+              <w:suppressLineNumbers/>
+              <w:bidi w:val="0"/>
               <w:jc w:val="start"/>
               <w:rPr/>
             </w:pPr>
@@ -1807,15 +2752,16 @@
         </w:tc>
         <w:tc>
           <w:tcPr>
-            <w:tcW w:w="2679" w:type="dxa"/>
-            <w:tcBorders/>
-            <w:vAlign w:val="center"/>
-          </w:tcPr>
-          <w:p>
-            <w:pPr>
-              <w:pStyle w:val="TableContents"/>
-              <w:bidi w:val="0"/>
-              <w:spacing w:before="0" w:after="283"/>
+            <w:tcW w:w="3168" w:type="dxa"/>
+            <w:tcBorders/>
+            <w:vAlign w:val="center"/>
+          </w:tcPr>
+          <w:p>
+            <w:pPr>
+              <w:pStyle w:val="TableContents"/>
+              <w:widowControl w:val="false"/>
+              <w:suppressLineNumbers/>
+              <w:bidi w:val="0"/>
               <w:jc w:val="start"/>
               <w:rPr/>
             </w:pPr>
@@ -1827,15 +2773,16 @@
         </w:tc>
         <w:tc>
           <w:tcPr>
-            <w:tcW w:w="888" w:type="dxa"/>
-            <w:tcBorders/>
-            <w:vAlign w:val="center"/>
-          </w:tcPr>
-          <w:p>
-            <w:pPr>
-              <w:pStyle w:val="TableContents"/>
-              <w:bidi w:val="0"/>
-              <w:spacing w:before="0" w:after="283"/>
+            <w:tcW w:w="1672" w:type="dxa"/>
+            <w:tcBorders/>
+            <w:vAlign w:val="center"/>
+          </w:tcPr>
+          <w:p>
+            <w:pPr>
+              <w:pStyle w:val="TableContents"/>
+              <w:widowControl w:val="false"/>
+              <w:suppressLineNumbers/>
+              <w:bidi w:val="0"/>
               <w:jc w:val="start"/>
               <w:rPr/>
             </w:pPr>
@@ -1857,8 +2804,9 @@
           <w:p>
             <w:pPr>
               <w:pStyle w:val="TableContents"/>
-              <w:bidi w:val="0"/>
-              <w:spacing w:before="0" w:after="283"/>
+              <w:widowControl w:val="false"/>
+              <w:suppressLineNumbers/>
+              <w:bidi w:val="0"/>
               <w:jc w:val="start"/>
               <w:rPr/>
             </w:pPr>
@@ -1870,15 +2818,16 @@
         </w:tc>
         <w:tc>
           <w:tcPr>
-            <w:tcW w:w="3889" w:type="dxa"/>
-            <w:tcBorders/>
-            <w:vAlign w:val="center"/>
-          </w:tcPr>
-          <w:p>
-            <w:pPr>
-              <w:pStyle w:val="TableContents"/>
-              <w:bidi w:val="0"/>
-              <w:spacing w:before="0" w:after="283"/>
+            <w:tcW w:w="4191" w:type="dxa"/>
+            <w:tcBorders/>
+            <w:vAlign w:val="center"/>
+          </w:tcPr>
+          <w:p>
+            <w:pPr>
+              <w:pStyle w:val="TableContents"/>
+              <w:widowControl w:val="false"/>
+              <w:suppressLineNumbers/>
+              <w:bidi w:val="0"/>
               <w:jc w:val="start"/>
               <w:rPr/>
             </w:pPr>
@@ -1890,15 +2839,16 @@
         </w:tc>
         <w:tc>
           <w:tcPr>
-            <w:tcW w:w="2679" w:type="dxa"/>
-            <w:tcBorders/>
-            <w:vAlign w:val="center"/>
-          </w:tcPr>
-          <w:p>
-            <w:pPr>
-              <w:pStyle w:val="TableContents"/>
-              <w:bidi w:val="0"/>
-              <w:spacing w:before="0" w:after="283"/>
+            <w:tcW w:w="3168" w:type="dxa"/>
+            <w:tcBorders/>
+            <w:vAlign w:val="center"/>
+          </w:tcPr>
+          <w:p>
+            <w:pPr>
+              <w:pStyle w:val="TableContents"/>
+              <w:widowControl w:val="false"/>
+              <w:suppressLineNumbers/>
+              <w:bidi w:val="0"/>
               <w:jc w:val="start"/>
               <w:rPr/>
             </w:pPr>
@@ -1910,15 +2860,16 @@
         </w:tc>
         <w:tc>
           <w:tcPr>
-            <w:tcW w:w="888" w:type="dxa"/>
-            <w:tcBorders/>
-            <w:vAlign w:val="center"/>
-          </w:tcPr>
-          <w:p>
-            <w:pPr>
-              <w:pStyle w:val="TableContents"/>
-              <w:bidi w:val="0"/>
-              <w:spacing w:before="0" w:after="283"/>
+            <w:tcW w:w="1672" w:type="dxa"/>
+            <w:tcBorders/>
+            <w:vAlign w:val="center"/>
+          </w:tcPr>
+          <w:p>
+            <w:pPr>
+              <w:pStyle w:val="TableContents"/>
+              <w:widowControl w:val="false"/>
+              <w:suppressLineNumbers/>
+              <w:bidi w:val="0"/>
               <w:jc w:val="start"/>
               <w:rPr/>
             </w:pPr>
@@ -1940,8 +2891,9 @@
           <w:p>
             <w:pPr>
               <w:pStyle w:val="TableContents"/>
-              <w:bidi w:val="0"/>
-              <w:spacing w:before="0" w:after="283"/>
+              <w:widowControl w:val="false"/>
+              <w:suppressLineNumbers/>
+              <w:bidi w:val="0"/>
               <w:jc w:val="start"/>
               <w:rPr/>
             </w:pPr>
@@ -1953,15 +2905,16 @@
         </w:tc>
         <w:tc>
           <w:tcPr>
-            <w:tcW w:w="3889" w:type="dxa"/>
-            <w:tcBorders/>
-            <w:vAlign w:val="center"/>
-          </w:tcPr>
-          <w:p>
-            <w:pPr>
-              <w:pStyle w:val="TableContents"/>
-              <w:bidi w:val="0"/>
-              <w:spacing w:before="0" w:after="283"/>
+            <w:tcW w:w="4191" w:type="dxa"/>
+            <w:tcBorders/>
+            <w:vAlign w:val="center"/>
+          </w:tcPr>
+          <w:p>
+            <w:pPr>
+              <w:pStyle w:val="TableContents"/>
+              <w:widowControl w:val="false"/>
+              <w:suppressLineNumbers/>
+              <w:bidi w:val="0"/>
               <w:jc w:val="start"/>
               <w:rPr/>
             </w:pPr>
@@ -1973,15 +2926,16 @@
         </w:tc>
         <w:tc>
           <w:tcPr>
-            <w:tcW w:w="2679" w:type="dxa"/>
-            <w:tcBorders/>
-            <w:vAlign w:val="center"/>
-          </w:tcPr>
-          <w:p>
-            <w:pPr>
-              <w:pStyle w:val="TableContents"/>
-              <w:bidi w:val="0"/>
-              <w:spacing w:before="0" w:after="283"/>
+            <w:tcW w:w="3168" w:type="dxa"/>
+            <w:tcBorders/>
+            <w:vAlign w:val="center"/>
+          </w:tcPr>
+          <w:p>
+            <w:pPr>
+              <w:pStyle w:val="TableContents"/>
+              <w:widowControl w:val="false"/>
+              <w:suppressLineNumbers/>
+              <w:bidi w:val="0"/>
               <w:jc w:val="start"/>
               <w:rPr/>
             </w:pPr>
@@ -1993,15 +2947,16 @@
         </w:tc>
         <w:tc>
           <w:tcPr>
-            <w:tcW w:w="888" w:type="dxa"/>
-            <w:tcBorders/>
-            <w:vAlign w:val="center"/>
-          </w:tcPr>
-          <w:p>
-            <w:pPr>
-              <w:pStyle w:val="TableContents"/>
-              <w:bidi w:val="0"/>
-              <w:spacing w:before="0" w:after="283"/>
+            <w:tcW w:w="1672" w:type="dxa"/>
+            <w:tcBorders/>
+            <w:vAlign w:val="center"/>
+          </w:tcPr>
+          <w:p>
+            <w:pPr>
+              <w:pStyle w:val="TableContents"/>
+              <w:widowControl w:val="false"/>
+              <w:suppressLineNumbers/>
+              <w:bidi w:val="0"/>
               <w:jc w:val="start"/>
               <w:rPr/>
             </w:pPr>
@@ -2023,8 +2978,9 @@
           <w:p>
             <w:pPr>
               <w:pStyle w:val="TableContents"/>
-              <w:bidi w:val="0"/>
-              <w:spacing w:before="0" w:after="283"/>
+              <w:widowControl w:val="false"/>
+              <w:suppressLineNumbers/>
+              <w:bidi w:val="0"/>
               <w:jc w:val="start"/>
               <w:rPr/>
             </w:pPr>
@@ -2036,15 +2992,16 @@
         </w:tc>
         <w:tc>
           <w:tcPr>
-            <w:tcW w:w="3889" w:type="dxa"/>
-            <w:tcBorders/>
-            <w:vAlign w:val="center"/>
-          </w:tcPr>
-          <w:p>
-            <w:pPr>
-              <w:pStyle w:val="TableContents"/>
-              <w:bidi w:val="0"/>
-              <w:spacing w:before="0" w:after="283"/>
+            <w:tcW w:w="4191" w:type="dxa"/>
+            <w:tcBorders/>
+            <w:vAlign w:val="center"/>
+          </w:tcPr>
+          <w:p>
+            <w:pPr>
+              <w:pStyle w:val="TableContents"/>
+              <w:widowControl w:val="false"/>
+              <w:suppressLineNumbers/>
+              <w:bidi w:val="0"/>
               <w:jc w:val="start"/>
               <w:rPr/>
             </w:pPr>
@@ -2056,15 +3013,16 @@
         </w:tc>
         <w:tc>
           <w:tcPr>
-            <w:tcW w:w="2679" w:type="dxa"/>
-            <w:tcBorders/>
-            <w:vAlign w:val="center"/>
-          </w:tcPr>
-          <w:p>
-            <w:pPr>
-              <w:pStyle w:val="TableContents"/>
-              <w:bidi w:val="0"/>
-              <w:spacing w:before="0" w:after="283"/>
+            <w:tcW w:w="3168" w:type="dxa"/>
+            <w:tcBorders/>
+            <w:vAlign w:val="center"/>
+          </w:tcPr>
+          <w:p>
+            <w:pPr>
+              <w:pStyle w:val="TableContents"/>
+              <w:widowControl w:val="false"/>
+              <w:suppressLineNumbers/>
+              <w:bidi w:val="0"/>
               <w:jc w:val="start"/>
               <w:rPr/>
             </w:pPr>
@@ -2076,15 +3034,16 @@
         </w:tc>
         <w:tc>
           <w:tcPr>
-            <w:tcW w:w="888" w:type="dxa"/>
-            <w:tcBorders/>
-            <w:vAlign w:val="center"/>
-          </w:tcPr>
-          <w:p>
-            <w:pPr>
-              <w:pStyle w:val="TableContents"/>
-              <w:bidi w:val="0"/>
-              <w:spacing w:before="0" w:after="283"/>
+            <w:tcW w:w="1672" w:type="dxa"/>
+            <w:tcBorders/>
+            <w:vAlign w:val="center"/>
+          </w:tcPr>
+          <w:p>
+            <w:pPr>
+              <w:pStyle w:val="TableContents"/>
+              <w:widowControl w:val="false"/>
+              <w:suppressLineNumbers/>
+              <w:bidi w:val="0"/>
               <w:jc w:val="start"/>
               <w:rPr/>
             </w:pPr>
@@ -2106,8 +3065,9 @@
           <w:p>
             <w:pPr>
               <w:pStyle w:val="TableContents"/>
-              <w:bidi w:val="0"/>
-              <w:spacing w:before="0" w:after="283"/>
+              <w:widowControl w:val="false"/>
+              <w:suppressLineNumbers/>
+              <w:bidi w:val="0"/>
               <w:jc w:val="start"/>
               <w:rPr/>
             </w:pPr>
@@ -2119,15 +3079,16 @@
         </w:tc>
         <w:tc>
           <w:tcPr>
-            <w:tcW w:w="3889" w:type="dxa"/>
-            <w:tcBorders/>
-            <w:vAlign w:val="center"/>
-          </w:tcPr>
-          <w:p>
-            <w:pPr>
-              <w:pStyle w:val="TableContents"/>
-              <w:bidi w:val="0"/>
-              <w:spacing w:before="0" w:after="283"/>
+            <w:tcW w:w="4191" w:type="dxa"/>
+            <w:tcBorders/>
+            <w:vAlign w:val="center"/>
+          </w:tcPr>
+          <w:p>
+            <w:pPr>
+              <w:pStyle w:val="TableContents"/>
+              <w:widowControl w:val="false"/>
+              <w:suppressLineNumbers/>
+              <w:bidi w:val="0"/>
               <w:jc w:val="start"/>
               <w:rPr/>
             </w:pPr>
@@ -2139,15 +3100,16 @@
         </w:tc>
         <w:tc>
           <w:tcPr>
-            <w:tcW w:w="2679" w:type="dxa"/>
-            <w:tcBorders/>
-            <w:vAlign w:val="center"/>
-          </w:tcPr>
-          <w:p>
-            <w:pPr>
-              <w:pStyle w:val="TableContents"/>
-              <w:bidi w:val="0"/>
-              <w:spacing w:before="0" w:after="283"/>
+            <w:tcW w:w="3168" w:type="dxa"/>
+            <w:tcBorders/>
+            <w:vAlign w:val="center"/>
+          </w:tcPr>
+          <w:p>
+            <w:pPr>
+              <w:pStyle w:val="TableContents"/>
+              <w:widowControl w:val="false"/>
+              <w:suppressLineNumbers/>
+              <w:bidi w:val="0"/>
               <w:jc w:val="start"/>
               <w:rPr/>
             </w:pPr>
@@ -2159,15 +3121,16 @@
         </w:tc>
         <w:tc>
           <w:tcPr>
-            <w:tcW w:w="888" w:type="dxa"/>
-            <w:tcBorders/>
-            <w:vAlign w:val="center"/>
-          </w:tcPr>
-          <w:p>
-            <w:pPr>
-              <w:pStyle w:val="TableContents"/>
-              <w:bidi w:val="0"/>
-              <w:spacing w:before="0" w:after="283"/>
+            <w:tcW w:w="1672" w:type="dxa"/>
+            <w:tcBorders/>
+            <w:vAlign w:val="center"/>
+          </w:tcPr>
+          <w:p>
+            <w:pPr>
+              <w:pStyle w:val="TableContents"/>
+              <w:widowControl w:val="false"/>
+              <w:suppressLineNumbers/>
+              <w:bidi w:val="0"/>
               <w:jc w:val="start"/>
               <w:rPr/>
             </w:pPr>
@@ -2189,8 +3152,9 @@
           <w:p>
             <w:pPr>
               <w:pStyle w:val="TableContents"/>
-              <w:bidi w:val="0"/>
-              <w:spacing w:before="0" w:after="283"/>
+              <w:widowControl w:val="false"/>
+              <w:suppressLineNumbers/>
+              <w:bidi w:val="0"/>
               <w:jc w:val="start"/>
               <w:rPr/>
             </w:pPr>
@@ -2202,15 +3166,16 @@
         </w:tc>
         <w:tc>
           <w:tcPr>
-            <w:tcW w:w="3889" w:type="dxa"/>
-            <w:tcBorders/>
-            <w:vAlign w:val="center"/>
-          </w:tcPr>
-          <w:p>
-            <w:pPr>
-              <w:pStyle w:val="TableContents"/>
-              <w:bidi w:val="0"/>
-              <w:spacing w:before="0" w:after="283"/>
+            <w:tcW w:w="4191" w:type="dxa"/>
+            <w:tcBorders/>
+            <w:vAlign w:val="center"/>
+          </w:tcPr>
+          <w:p>
+            <w:pPr>
+              <w:pStyle w:val="TableContents"/>
+              <w:widowControl w:val="false"/>
+              <w:suppressLineNumbers/>
+              <w:bidi w:val="0"/>
               <w:jc w:val="start"/>
               <w:rPr/>
             </w:pPr>
@@ -2222,15 +3187,16 @@
         </w:tc>
         <w:tc>
           <w:tcPr>
-            <w:tcW w:w="2679" w:type="dxa"/>
-            <w:tcBorders/>
-            <w:vAlign w:val="center"/>
-          </w:tcPr>
-          <w:p>
-            <w:pPr>
-              <w:pStyle w:val="TableContents"/>
-              <w:bidi w:val="0"/>
-              <w:spacing w:before="0" w:after="283"/>
+            <w:tcW w:w="3168" w:type="dxa"/>
+            <w:tcBorders/>
+            <w:vAlign w:val="center"/>
+          </w:tcPr>
+          <w:p>
+            <w:pPr>
+              <w:pStyle w:val="TableContents"/>
+              <w:widowControl w:val="false"/>
+              <w:suppressLineNumbers/>
+              <w:bidi w:val="0"/>
               <w:jc w:val="start"/>
               <w:rPr/>
             </w:pPr>
@@ -2242,15 +3208,16 @@
         </w:tc>
         <w:tc>
           <w:tcPr>
-            <w:tcW w:w="888" w:type="dxa"/>
-            <w:tcBorders/>
-            <w:vAlign w:val="center"/>
-          </w:tcPr>
-          <w:p>
-            <w:pPr>
-              <w:pStyle w:val="TableContents"/>
-              <w:bidi w:val="0"/>
-              <w:spacing w:before="0" w:after="283"/>
+            <w:tcW w:w="1672" w:type="dxa"/>
+            <w:tcBorders/>
+            <w:vAlign w:val="center"/>
+          </w:tcPr>
+          <w:p>
+            <w:pPr>
+              <w:pStyle w:val="TableContents"/>
+              <w:widowControl w:val="false"/>
+              <w:suppressLineNumbers/>
+              <w:bidi w:val="0"/>
               <w:jc w:val="start"/>
               <w:rPr/>
             </w:pPr>
@@ -2272,8 +3239,9 @@
           <w:p>
             <w:pPr>
               <w:pStyle w:val="TableContents"/>
-              <w:bidi w:val="0"/>
-              <w:spacing w:before="0" w:after="283"/>
+              <w:widowControl w:val="false"/>
+              <w:suppressLineNumbers/>
+              <w:bidi w:val="0"/>
               <w:jc w:val="start"/>
               <w:rPr/>
             </w:pPr>
@@ -2285,15 +3253,16 @@
         </w:tc>
         <w:tc>
           <w:tcPr>
-            <w:tcW w:w="3889" w:type="dxa"/>
-            <w:tcBorders/>
-            <w:vAlign w:val="center"/>
-          </w:tcPr>
-          <w:p>
-            <w:pPr>
-              <w:pStyle w:val="TableContents"/>
-              <w:bidi w:val="0"/>
-              <w:spacing w:before="0" w:after="283"/>
+            <w:tcW w:w="4191" w:type="dxa"/>
+            <w:tcBorders/>
+            <w:vAlign w:val="center"/>
+          </w:tcPr>
+          <w:p>
+            <w:pPr>
+              <w:pStyle w:val="TableContents"/>
+              <w:widowControl w:val="false"/>
+              <w:suppressLineNumbers/>
+              <w:bidi w:val="0"/>
               <w:jc w:val="start"/>
               <w:rPr/>
             </w:pPr>
@@ -2305,15 +3274,16 @@
         </w:tc>
         <w:tc>
           <w:tcPr>
-            <w:tcW w:w="2679" w:type="dxa"/>
-            <w:tcBorders/>
-            <w:vAlign w:val="center"/>
-          </w:tcPr>
-          <w:p>
-            <w:pPr>
-              <w:pStyle w:val="TableContents"/>
-              <w:bidi w:val="0"/>
-              <w:spacing w:before="0" w:after="283"/>
+            <w:tcW w:w="3168" w:type="dxa"/>
+            <w:tcBorders/>
+            <w:vAlign w:val="center"/>
+          </w:tcPr>
+          <w:p>
+            <w:pPr>
+              <w:pStyle w:val="TableContents"/>
+              <w:widowControl w:val="false"/>
+              <w:suppressLineNumbers/>
+              <w:bidi w:val="0"/>
               <w:jc w:val="start"/>
               <w:rPr/>
             </w:pPr>
@@ -2325,15 +3295,16 @@
         </w:tc>
         <w:tc>
           <w:tcPr>
-            <w:tcW w:w="888" w:type="dxa"/>
-            <w:tcBorders/>
-            <w:vAlign w:val="center"/>
-          </w:tcPr>
-          <w:p>
-            <w:pPr>
-              <w:pStyle w:val="TableContents"/>
-              <w:bidi w:val="0"/>
-              <w:spacing w:before="0" w:after="283"/>
+            <w:tcW w:w="1672" w:type="dxa"/>
+            <w:tcBorders/>
+            <w:vAlign w:val="center"/>
+          </w:tcPr>
+          <w:p>
+            <w:pPr>
+              <w:pStyle w:val="TableContents"/>
+              <w:widowControl w:val="false"/>
+              <w:suppressLineNumbers/>
+              <w:bidi w:val="0"/>
               <w:jc w:val="start"/>
               <w:rPr/>
             </w:pPr>
@@ -2355,8 +3326,9 @@
           <w:p>
             <w:pPr>
               <w:pStyle w:val="TableContents"/>
-              <w:bidi w:val="0"/>
-              <w:spacing w:before="0" w:after="283"/>
+              <w:widowControl w:val="false"/>
+              <w:suppressLineNumbers/>
+              <w:bidi w:val="0"/>
               <w:jc w:val="start"/>
               <w:rPr/>
             </w:pPr>
@@ -2368,15 +3340,16 @@
         </w:tc>
         <w:tc>
           <w:tcPr>
-            <w:tcW w:w="3889" w:type="dxa"/>
-            <w:tcBorders/>
-            <w:vAlign w:val="center"/>
-          </w:tcPr>
-          <w:p>
-            <w:pPr>
-              <w:pStyle w:val="TableContents"/>
-              <w:bidi w:val="0"/>
-              <w:spacing w:before="0" w:after="283"/>
+            <w:tcW w:w="4191" w:type="dxa"/>
+            <w:tcBorders/>
+            <w:vAlign w:val="center"/>
+          </w:tcPr>
+          <w:p>
+            <w:pPr>
+              <w:pStyle w:val="TableContents"/>
+              <w:widowControl w:val="false"/>
+              <w:suppressLineNumbers/>
+              <w:bidi w:val="0"/>
               <w:jc w:val="start"/>
               <w:rPr/>
             </w:pPr>
@@ -2388,15 +3361,16 @@
         </w:tc>
         <w:tc>
           <w:tcPr>
-            <w:tcW w:w="2679" w:type="dxa"/>
-            <w:tcBorders/>
-            <w:vAlign w:val="center"/>
-          </w:tcPr>
-          <w:p>
-            <w:pPr>
-              <w:pStyle w:val="TableContents"/>
-              <w:bidi w:val="0"/>
-              <w:spacing w:before="0" w:after="283"/>
+            <w:tcW w:w="3168" w:type="dxa"/>
+            <w:tcBorders/>
+            <w:vAlign w:val="center"/>
+          </w:tcPr>
+          <w:p>
+            <w:pPr>
+              <w:pStyle w:val="TableContents"/>
+              <w:widowControl w:val="false"/>
+              <w:suppressLineNumbers/>
+              <w:bidi w:val="0"/>
               <w:jc w:val="start"/>
               <w:rPr/>
             </w:pPr>
@@ -2408,15 +3382,16 @@
         </w:tc>
         <w:tc>
           <w:tcPr>
-            <w:tcW w:w="888" w:type="dxa"/>
-            <w:tcBorders/>
-            <w:vAlign w:val="center"/>
-          </w:tcPr>
-          <w:p>
-            <w:pPr>
-              <w:pStyle w:val="TableContents"/>
-              <w:bidi w:val="0"/>
-              <w:spacing w:before="0" w:after="283"/>
+            <w:tcW w:w="1672" w:type="dxa"/>
+            <w:tcBorders/>
+            <w:vAlign w:val="center"/>
+          </w:tcPr>
+          <w:p>
+            <w:pPr>
+              <w:pStyle w:val="TableContents"/>
+              <w:widowControl w:val="false"/>
+              <w:suppressLineNumbers/>
+              <w:bidi w:val="0"/>
               <w:jc w:val="start"/>
               <w:rPr/>
             </w:pPr>
@@ -2438,8 +3413,9 @@
           <w:p>
             <w:pPr>
               <w:pStyle w:val="TableContents"/>
-              <w:bidi w:val="0"/>
-              <w:spacing w:before="0" w:after="283"/>
+              <w:widowControl w:val="false"/>
+              <w:suppressLineNumbers/>
+              <w:bidi w:val="0"/>
               <w:jc w:val="start"/>
               <w:rPr/>
             </w:pPr>
@@ -2451,15 +3427,16 @@
         </w:tc>
         <w:tc>
           <w:tcPr>
-            <w:tcW w:w="3889" w:type="dxa"/>
-            <w:tcBorders/>
-            <w:vAlign w:val="center"/>
-          </w:tcPr>
-          <w:p>
-            <w:pPr>
-              <w:pStyle w:val="TableContents"/>
-              <w:bidi w:val="0"/>
-              <w:spacing w:before="0" w:after="283"/>
+            <w:tcW w:w="4191" w:type="dxa"/>
+            <w:tcBorders/>
+            <w:vAlign w:val="center"/>
+          </w:tcPr>
+          <w:p>
+            <w:pPr>
+              <w:pStyle w:val="TableContents"/>
+              <w:widowControl w:val="false"/>
+              <w:suppressLineNumbers/>
+              <w:bidi w:val="0"/>
               <w:jc w:val="start"/>
               <w:rPr/>
             </w:pPr>
@@ -2471,15 +3448,16 @@
         </w:tc>
         <w:tc>
           <w:tcPr>
-            <w:tcW w:w="2679" w:type="dxa"/>
-            <w:tcBorders/>
-            <w:vAlign w:val="center"/>
-          </w:tcPr>
-          <w:p>
-            <w:pPr>
-              <w:pStyle w:val="TableContents"/>
-              <w:bidi w:val="0"/>
-              <w:spacing w:before="0" w:after="283"/>
+            <w:tcW w:w="3168" w:type="dxa"/>
+            <w:tcBorders/>
+            <w:vAlign w:val="center"/>
+          </w:tcPr>
+          <w:p>
+            <w:pPr>
+              <w:pStyle w:val="TableContents"/>
+              <w:widowControl w:val="false"/>
+              <w:suppressLineNumbers/>
+              <w:bidi w:val="0"/>
               <w:jc w:val="start"/>
               <w:rPr/>
             </w:pPr>
@@ -2491,15 +3469,16 @@
         </w:tc>
         <w:tc>
           <w:tcPr>
-            <w:tcW w:w="888" w:type="dxa"/>
-            <w:tcBorders/>
-            <w:vAlign w:val="center"/>
-          </w:tcPr>
-          <w:p>
-            <w:pPr>
-              <w:pStyle w:val="TableContents"/>
-              <w:bidi w:val="0"/>
-              <w:spacing w:before="0" w:after="283"/>
+            <w:tcW w:w="1672" w:type="dxa"/>
+            <w:tcBorders/>
+            <w:vAlign w:val="center"/>
+          </w:tcPr>
+          <w:p>
+            <w:pPr>
+              <w:pStyle w:val="TableContents"/>
+              <w:widowControl w:val="false"/>
+              <w:suppressLineNumbers/>
+              <w:bidi w:val="0"/>
               <w:jc w:val="start"/>
               <w:rPr/>
             </w:pPr>
@@ -2521,8 +3500,9 @@
           <w:p>
             <w:pPr>
               <w:pStyle w:val="TableContents"/>
-              <w:bidi w:val="0"/>
-              <w:spacing w:before="0" w:after="283"/>
+              <w:widowControl w:val="false"/>
+              <w:suppressLineNumbers/>
+              <w:bidi w:val="0"/>
               <w:jc w:val="start"/>
               <w:rPr/>
             </w:pPr>
@@ -2534,61 +3514,151 @@
         </w:tc>
         <w:tc>
           <w:tcPr>
-            <w:tcW w:w="3889" w:type="dxa"/>
-            <w:tcBorders/>
-            <w:vAlign w:val="center"/>
-          </w:tcPr>
-          <w:p>
-            <w:pPr>
-              <w:pStyle w:val="TableContents"/>
-              <w:bidi w:val="0"/>
-              <w:spacing w:before="0" w:after="283"/>
-              <w:jc w:val="start"/>
-              <w:rPr/>
-            </w:pPr>
-            <w:r>
-              <w:rPr/>
-              <w:t>Windows Forms on this Linux host</w:t>
-            </w:r>
-          </w:p>
-        </w:tc>
-        <w:tc>
-          <w:tcPr>
-            <w:tcW w:w="2679" w:type="dxa"/>
-            <w:tcBorders/>
-            <w:vAlign w:val="center"/>
-          </w:tcPr>
-          <w:p>
-            <w:pPr>
-              <w:pStyle w:val="TableContents"/>
-              <w:bidi w:val="0"/>
-              <w:spacing w:before="0" w:after="283"/>
-              <w:jc w:val="start"/>
-              <w:rPr/>
-            </w:pPr>
-            <w:r>
-              <w:rPr/>
-              <w:t>Not executed</w:t>
-            </w:r>
-          </w:p>
-        </w:tc>
-        <w:tc>
-          <w:tcPr>
-            <w:tcW w:w="888" w:type="dxa"/>
-            <w:tcBorders/>
-            <w:vAlign w:val="center"/>
-          </w:tcPr>
-          <w:p>
-            <w:pPr>
-              <w:pStyle w:val="TableContents"/>
-              <w:bidi w:val="0"/>
-              <w:spacing w:before="0" w:after="283"/>
-              <w:jc w:val="start"/>
-              <w:rPr/>
-            </w:pPr>
-            <w:r>
-              <w:rPr/>
-              <w:t>Not run</w:t>
+            <w:tcW w:w="4191" w:type="dxa"/>
+            <w:tcBorders/>
+            <w:vAlign w:val="center"/>
+          </w:tcPr>
+          <w:p>
+            <w:pPr>
+              <w:pStyle w:val="TableContents"/>
+              <w:widowControl w:val="false"/>
+              <w:suppressLineNumbers/>
+              <w:bidi w:val="0"/>
+              <w:jc w:val="start"/>
+              <w:rPr/>
+            </w:pPr>
+            <w:r>
+              <w:rPr/>
+              <w:t>Linux GTK host: register Shot01, walk 4000/3/30</w:t>
+            </w:r>
+          </w:p>
+        </w:tc>
+        <w:tc>
+          <w:tcPr>
+            <w:tcW w:w="3168" w:type="dxa"/>
+            <w:tcBorders/>
+            <w:vAlign w:val="center"/>
+          </w:tcPr>
+          <w:p>
+            <w:pPr>
+              <w:pStyle w:val="TableContents"/>
+              <w:widowControl w:val="false"/>
+              <w:suppressLineNumbers/>
+              <w:bidi w:val="0"/>
+              <w:jc w:val="start"/>
+              <w:rPr/>
+            </w:pPr>
+            <w:r>
+              <w:rPr/>
+              <w:t>141.75 recorded; goal 100 achieved</w:t>
+            </w:r>
+          </w:p>
+        </w:tc>
+        <w:tc>
+          <w:tcPr>
+            <w:tcW w:w="1672" w:type="dxa"/>
+            <w:tcBorders/>
+            <w:vAlign w:val="center"/>
+          </w:tcPr>
+          <w:p>
+            <w:pPr>
+              <w:pStyle w:val="TableContents"/>
+              <w:widowControl w:val="false"/>
+              <w:suppressLineNumbers/>
+              <w:bidi w:val="0"/>
+              <w:jc w:val="start"/>
+              <w:rPr/>
+            </w:pPr>
+            <w:r>
+              <w:rPr/>
+              <w:t>Pass — Figure 7</w:t>
+            </w:r>
+          </w:p>
+        </w:tc>
+      </w:tr>
+      <w:tr>
+        <w:trPr/>
+        <w:tc>
+          <w:tcPr>
+            <w:tcW w:w="658" w:type="dxa"/>
+            <w:tcBorders/>
+            <w:vAlign w:val="center"/>
+          </w:tcPr>
+          <w:p>
+            <w:pPr>
+              <w:pStyle w:val="TableContents"/>
+              <w:widowControl w:val="false"/>
+              <w:suppressLineNumbers/>
+              <w:bidi w:val="0"/>
+              <w:jc w:val="start"/>
+              <w:rPr/>
+            </w:pPr>
+            <w:r>
+              <w:rPr/>
+              <w:t>C13</w:t>
+            </w:r>
+          </w:p>
+        </w:tc>
+        <w:tc>
+          <w:tcPr>
+            <w:tcW w:w="4191" w:type="dxa"/>
+            <w:tcBorders/>
+            <w:vAlign w:val="center"/>
+          </w:tcPr>
+          <w:p>
+            <w:pPr>
+              <w:pStyle w:val="TableContents"/>
+              <w:widowControl w:val="false"/>
+              <w:suppressLineNumbers/>
+              <w:bidi w:val="0"/>
+              <w:jc w:val="start"/>
+              <w:rPr/>
+            </w:pPr>
+            <w:r>
+              <w:rPr/>
+              <w:t>Visual Studio WinForms on Windows</w:t>
+            </w:r>
+          </w:p>
+        </w:tc>
+        <w:tc>
+          <w:tcPr>
+            <w:tcW w:w="3168" w:type="dxa"/>
+            <w:tcBorders/>
+            <w:vAlign w:val="center"/>
+          </w:tcPr>
+          <w:p>
+            <w:pPr>
+              <w:pStyle w:val="TableContents"/>
+              <w:widowControl w:val="false"/>
+              <w:suppressLineNumbers/>
+              <w:bidi w:val="0"/>
+              <w:jc w:val="start"/>
+              <w:rPr/>
+            </w:pPr>
+            <w:r>
+              <w:rPr/>
+              <w:t>Project opens and runs</w:t>
+            </w:r>
+          </w:p>
+        </w:tc>
+        <w:tc>
+          <w:tcPr>
+            <w:tcW w:w="1672" w:type="dxa"/>
+            <w:tcBorders/>
+            <w:vAlign w:val="center"/>
+          </w:tcPr>
+          <w:p>
+            <w:pPr>
+              <w:pStyle w:val="TableContents"/>
+              <w:widowControl w:val="false"/>
+              <w:suppressLineNumbers/>
+              <w:bidi w:val="0"/>
+              <w:jc w:val="start"/>
+              <w:rPr/>
+            </w:pPr>
+            <w:r>
+              <w:rPr/>
+              <w:t>Not run here</w:t>
             </w:r>
           </w:p>
         </w:tc>
@@ -2598,32 +3668,350 @@
       <w:pPr>
         <w:pStyle w:val="BodyText"/>
         <w:bidi w:val="0"/>
-        <w:spacing w:before="0" w:after="283"/>
-        <w:jc w:val="start"/>
-        <w:rPr/>
-      </w:pPr>
-      <w:r>
-        <w:rPr/>
-        <w:t>C# result line: Passed! Failed: 0, Passed: 6, Skipped: 0, Total: 6. SDK 8.0.425. The graphical interface still needs a Windows desktop run before hand-in is complete.</w:t>
+        <w:spacing w:lineRule="auto" w:line="276" w:before="0" w:after="140"/>
+        <w:jc w:val="start"/>
+        <w:rPr/>
+      </w:pPr>
+      <w:r>
+        <w:rPr/>
+        <w:t>C# result line: Passed! Failed: 0, Passed: 6, Skipped: 0, Total: 6. SDK 8.0.425. Linux GTK shots are Figures 2–7. Visual Studio on Windows is still required for the USB.</w:t>
       </w:r>
     </w:p>
     <w:p>
       <w:pPr>
         <w:pStyle w:val="BodyTextwc"/>
         <w:bidi w:val="0"/>
-        <w:spacing w:before="360" w:after="283"/>
-        <w:jc w:val="start"/>
-        <w:rPr/>
-      </w:pPr>
-      <w:r>
-        <w:rPr/>
-        <w:t>Written section count: 1498 words. This count includes the three task discussions and their headings. It excludes the title page, contents, tables, figure caption and the reference list.</w:t>
+        <w:spacing w:before="360" w:after="140"/>
+        <w:jc w:val="start"/>
+        <w:rPr/>
+      </w:pPr>
+      <w:r>
+        <w:rPr/>
+        <w:t>Written section count: 1498 words. This count includes the three task discussions and their headings. It excludes the title page, contents, tables, figure captions and the reference list.</w:t>
       </w:r>
     </w:p>
     <w:p>
       <w:pPr>
         <w:pStyle w:val="Heading1"/>
-        <w:bidi w:val="0"/>
+        <w:numPr>
+          <w:ilvl w:val="0"/>
+          <w:numId w:val="0"/>
+        </w:numPr>
+        <w:bidi w:val="0"/>
+        <w:spacing w:before="240" w:after="120"/>
+        <w:jc w:val="start"/>
+        <w:rPr/>
+      </w:pPr>
+      <w:r>
+        <w:rPr/>
+        <w:t>Appendix C — Graphical interface shots</w:t>
+      </w:r>
+    </w:p>
+    <w:p>
+      <w:pPr>
+        <w:pStyle w:val="BodyText"/>
+        <w:bidi w:val="0"/>
+        <w:spacing w:lineRule="auto" w:line="276" w:before="0" w:after="140"/>
+        <w:jc w:val="start"/>
+        <w:rPr/>
+      </w:pPr>
+      <w:r>
+        <w:rPr/>
+        <w:t>These figures are from the Linux GTK host of the same form. They are not a Visual Studio run.</w:t>
+      </w:r>
+    </w:p>
+    <w:p>
+      <w:pPr>
+        <w:pStyle w:val="BodyText"/>
+        <w:bidi w:val="0"/>
+        <w:spacing w:lineRule="auto" w:line="276" w:before="0" w:after="140"/>
+        <w:jc w:val="start"/>
+        <w:rPr/>
+      </w:pPr>
+      <w:r>
+        <w:rPr/>
+        <w:drawing>
+          <wp:inline distT="0" distB="0" distL="0" distR="0">
+            <wp:extent cx="8382000" cy="9801225"/>
+            <wp:effectExtent l="0" t="0" r="0" b="0"/>
+            <wp:docPr id="4" name="Image2" title="Empty login screen"/>
+            <wp:cNvGraphicFramePr>
+              <a:graphicFrameLocks xmlns:a="http://schemas.openxmlformats.org/drawingml/2006/main" noChangeAspect="1"/>
+            </wp:cNvGraphicFramePr>
+            <a:graphic xmlns:a="http://schemas.openxmlformats.org/drawingml/2006/main">
+              <a:graphicData uri="http://schemas.openxmlformats.org/drawingml/2006/picture">
+                <pic:pic xmlns:pic="http://schemas.openxmlformats.org/drawingml/2006/picture">
+                  <pic:nvPicPr>
+                    <pic:cNvPr id="4" name="Image2" title="Empty login screen"/>
+                    <pic:cNvPicPr>
+                      <a:picLocks noChangeAspect="1" noChangeArrowheads="1"/>
+                    </pic:cNvPicPr>
+                  </pic:nvPicPr>
+                  <pic:blipFill>
+                    <a:blip r:embed="rId6"/>
+                    <a:stretch>
+                      <a:fillRect/>
+                    </a:stretch>
+                  </pic:blipFill>
+                  <pic:spPr bwMode="auto">
+                    <a:xfrm>
+                      <a:off x="0" y="0"/>
+                      <a:ext cx="8382000" cy="9801225"/>
+                    </a:xfrm>
+                    <a:prstGeom prst="rect">
+                      <a:avLst/>
+                    </a:prstGeom>
+                    <a:noFill/>
+                  </pic:spPr>
+                </pic:pic>
+              </a:graphicData>
+            </a:graphic>
+          </wp:inline>
+        </w:drawing>
+      </w:r>
+      <w:r>
+        <w:rPr/>
+        <w:t xml:space="preserve"> </w:t>
+      </w:r>
+      <w:r>
+        <w:rPr/>
+        <w:t xml:space="preserve">Figure 2. Login page with username, password, Register and Sign in. </w:t>
+      </w:r>
+      <w:r>
+        <w:rPr/>
+        <w:drawing>
+          <wp:inline distT="0" distB="0" distL="0" distR="0">
+            <wp:extent cx="8382000" cy="9801225"/>
+            <wp:effectExtent l="0" t="0" r="0" b="0"/>
+            <wp:docPr id="5" name="Image3" title="Filled login ready to register"/>
+            <wp:cNvGraphicFramePr>
+              <a:graphicFrameLocks xmlns:a="http://schemas.openxmlformats.org/drawingml/2006/main" noChangeAspect="1"/>
+            </wp:cNvGraphicFramePr>
+            <a:graphic xmlns:a="http://schemas.openxmlformats.org/drawingml/2006/main">
+              <a:graphicData uri="http://schemas.openxmlformats.org/drawingml/2006/picture">
+                <pic:pic xmlns:pic="http://schemas.openxmlformats.org/drawingml/2006/picture">
+                  <pic:nvPicPr>
+                    <pic:cNvPr id="5" name="Image3" title="Filled login ready to register"/>
+                    <pic:cNvPicPr>
+                      <a:picLocks noChangeAspect="1" noChangeArrowheads="1"/>
+                    </pic:cNvPicPr>
+                  </pic:nvPicPr>
+                  <pic:blipFill>
+                    <a:blip r:embed="rId7"/>
+                    <a:stretch>
+                      <a:fillRect/>
+                    </a:stretch>
+                  </pic:blipFill>
+                  <pic:spPr bwMode="auto">
+                    <a:xfrm>
+                      <a:off x="0" y="0"/>
+                      <a:ext cx="8382000" cy="9801225"/>
+                    </a:xfrm>
+                    <a:prstGeom prst="rect">
+                      <a:avLst/>
+                    </a:prstGeom>
+                    <a:noFill/>
+                  </pic:spPr>
+                </pic:pic>
+              </a:graphicData>
+            </a:graphic>
+          </wp:inline>
+        </w:drawing>
+      </w:r>
+      <w:r>
+        <w:rPr/>
+        <w:t xml:space="preserve"> Figure 3. Valid sample ready to register: Shot01 / Abcdefghijkl. </w:t>
+      </w:r>
+      <w:r>
+        <w:rPr/>
+        <w:drawing>
+          <wp:inline distT="0" distB="0" distL="0" distR="0">
+            <wp:extent cx="8382000" cy="9801225"/>
+            <wp:effectExtent l="0" t="0" r="0" b="0"/>
+            <wp:docPr id="6" name="Image4" title="Short password rejected"/>
+            <wp:cNvGraphicFramePr>
+              <a:graphicFrameLocks xmlns:a="http://schemas.openxmlformats.org/drawingml/2006/main" noChangeAspect="1"/>
+            </wp:cNvGraphicFramePr>
+            <a:graphic xmlns:a="http://schemas.openxmlformats.org/drawingml/2006/main">
+              <a:graphicData uri="http://schemas.openxmlformats.org/drawingml/2006/picture">
+                <pic:pic xmlns:pic="http://schemas.openxmlformats.org/drawingml/2006/picture">
+                  <pic:nvPicPr>
+                    <pic:cNvPr id="6" name="Image4" title="Short password rejected"/>
+                    <pic:cNvPicPr>
+                      <a:picLocks noChangeAspect="1" noChangeArrowheads="1"/>
+                    </pic:cNvPicPr>
+                  </pic:nvPicPr>
+                  <pic:blipFill>
+                    <a:blip r:embed="rId8"/>
+                    <a:stretch>
+                      <a:fillRect/>
+                    </a:stretch>
+                  </pic:blipFill>
+                  <pic:spPr bwMode="auto">
+                    <a:xfrm>
+                      <a:off x="0" y="0"/>
+                      <a:ext cx="8382000" cy="9801225"/>
+                    </a:xfrm>
+                    <a:prstGeom prst="rect">
+                      <a:avLst/>
+                    </a:prstGeom>
+                    <a:noFill/>
+                  </pic:spPr>
+                </pic:pic>
+              </a:graphicData>
+            </a:graphic>
+          </wp:inline>
+        </w:drawing>
+      </w:r>
+      <w:r>
+        <w:rPr/>
+        <w:t xml:space="preserve"> Figure 4. Password short is rejected. </w:t>
+      </w:r>
+      <w:r>
+        <w:rPr/>
+        <w:drawing>
+          <wp:inline distT="0" distB="0" distL="0" distR="0">
+            <wp:extent cx="8382000" cy="9801225"/>
+            <wp:effectExtent l="0" t="0" r="0" b="0"/>
+            <wp:docPr id="7" name="Image5" title="Account created message"/>
+            <wp:cNvGraphicFramePr>
+              <a:graphicFrameLocks xmlns:a="http://schemas.openxmlformats.org/drawingml/2006/main" noChangeAspect="1"/>
+            </wp:cNvGraphicFramePr>
+            <a:graphic xmlns:a="http://schemas.openxmlformats.org/drawingml/2006/main">
+              <a:graphicData uri="http://schemas.openxmlformats.org/drawingml/2006/picture">
+                <pic:pic xmlns:pic="http://schemas.openxmlformats.org/drawingml/2006/picture">
+                  <pic:nvPicPr>
+                    <pic:cNvPr id="7" name="Image5" title="Account created message"/>
+                    <pic:cNvPicPr>
+                      <a:picLocks noChangeAspect="1" noChangeArrowheads="1"/>
+                    </pic:cNvPicPr>
+                  </pic:nvPicPr>
+                  <pic:blipFill>
+                    <a:blip r:embed="rId9"/>
+                    <a:stretch>
+                      <a:fillRect/>
+                    </a:stretch>
+                  </pic:blipFill>
+                  <pic:spPr bwMode="auto">
+                    <a:xfrm>
+                      <a:off x="0" y="0"/>
+                      <a:ext cx="8382000" cy="9801225"/>
+                    </a:xfrm>
+                    <a:prstGeom prst="rect">
+                      <a:avLst/>
+                    </a:prstGeom>
+                    <a:noFill/>
+                  </pic:spPr>
+                </pic:pic>
+              </a:graphicData>
+            </a:graphic>
+          </wp:inline>
+        </w:drawing>
+      </w:r>
+      <w:r>
+        <w:rPr/>
+        <w:t xml:space="preserve"> Figure 5. Account created. Sign in. </w:t>
+      </w:r>
+      <w:r>
+        <w:rPr/>
+        <w:drawing>
+          <wp:inline distT="0" distB="0" distL="0" distR="0">
+            <wp:extent cx="8382000" cy="9801225"/>
+            <wp:effectExtent l="0" t="0" r="0" b="0"/>
+            <wp:docPr id="8" name="Image6" title="Signed in with default goal"/>
+            <wp:cNvGraphicFramePr>
+              <a:graphicFrameLocks xmlns:a="http://schemas.openxmlformats.org/drawingml/2006/main" noChangeAspect="1"/>
+            </wp:cNvGraphicFramePr>
+            <a:graphic xmlns:a="http://schemas.openxmlformats.org/drawingml/2006/main">
+              <a:graphicData uri="http://schemas.openxmlformats.org/drawingml/2006/picture">
+                <pic:pic xmlns:pic="http://schemas.openxmlformats.org/drawingml/2006/picture">
+                  <pic:nvPicPr>
+                    <pic:cNvPr id="8" name="Image6" title="Signed in with default goal"/>
+                    <pic:cNvPicPr>
+                      <a:picLocks noChangeAspect="1" noChangeArrowheads="1"/>
+                    </pic:cNvPicPr>
+                  </pic:nvPicPr>
+                  <pic:blipFill>
+                    <a:blip r:embed="rId10"/>
+                    <a:stretch>
+                      <a:fillRect/>
+                    </a:stretch>
+                  </pic:blipFill>
+                  <pic:spPr bwMode="auto">
+                    <a:xfrm>
+                      <a:off x="0" y="0"/>
+                      <a:ext cx="8382000" cy="9801225"/>
+                    </a:xfrm>
+                    <a:prstGeom prst="rect">
+                      <a:avLst/>
+                    </a:prstGeom>
+                    <a:noFill/>
+                  </pic:spPr>
+                </pic:pic>
+              </a:graphicData>
+            </a:graphic>
+          </wp:inline>
+        </w:drawing>
+      </w:r>
+      <w:r>
+        <w:rPr/>
+        <w:t xml:space="preserve"> Figure 6. Signed in. Goal 300. Total 0. Goal not yet achieved. </w:t>
+      </w:r>
+      <w:r>
+        <w:rPr/>
+        <w:drawing>
+          <wp:inline distT="0" distB="0" distL="0" distR="0">
+            <wp:extent cx="8382000" cy="9801225"/>
+            <wp:effectExtent l="0" t="0" r="0" b="0"/>
+            <wp:docPr id="9" name="Image7" title="Walking record and goal achieved"/>
+            <wp:cNvGraphicFramePr>
+              <a:graphicFrameLocks xmlns:a="http://schemas.openxmlformats.org/drawingml/2006/main" noChangeAspect="1"/>
+            </wp:cNvGraphicFramePr>
+            <a:graphic xmlns:a="http://schemas.openxmlformats.org/drawingml/2006/main">
+              <a:graphicData uri="http://schemas.openxmlformats.org/drawingml/2006/picture">
+                <pic:pic xmlns:pic="http://schemas.openxmlformats.org/drawingml/2006/picture">
+                  <pic:nvPicPr>
+                    <pic:cNvPr id="9" name="Image7" title="Walking record and goal achieved"/>
+                    <pic:cNvPicPr>
+                      <a:picLocks noChangeAspect="1" noChangeArrowheads="1"/>
+                    </pic:cNvPicPr>
+                  </pic:nvPicPr>
+                  <pic:blipFill>
+                    <a:blip r:embed="rId11"/>
+                    <a:stretch>
+                      <a:fillRect/>
+                    </a:stretch>
+                  </pic:blipFill>
+                  <pic:spPr bwMode="auto">
+                    <a:xfrm>
+                      <a:off x="0" y="0"/>
+                      <a:ext cx="8382000" cy="9801225"/>
+                    </a:xfrm>
+                    <a:prstGeom prst="rect">
+                      <a:avLst/>
+                    </a:prstGeom>
+                    <a:noFill/>
+                  </pic:spPr>
+                </pic:pic>
+              </a:graphicData>
+            </a:graphic>
+          </wp:inline>
+        </w:drawing>
+      </w:r>
+      <w:r>
+        <w:rPr/>
+        <w:t xml:space="preserve"> Figure 7. Walking 4000 steps, 3 km, 30 minutes = 141.75 calories. Goal 100 achieved. </w:t>
+      </w:r>
+    </w:p>
+    <w:p>
+      <w:pPr>
+        <w:pStyle w:val="Heading1"/>
+        <w:numPr>
+          <w:ilvl w:val="0"/>
+          <w:numId w:val="0"/>
+        </w:numPr>
+        <w:bidi w:val="0"/>
+        <w:spacing w:before="240" w:after="120"/>
         <w:jc w:val="start"/>
         <w:rPr/>
       </w:pPr>
@@ -2636,7 +4024,7 @@
       <w:pPr>
         <w:pStyle w:val="BodyText"/>
         <w:bidi w:val="0"/>
-        <w:spacing w:before="0" w:after="283"/>
+        <w:spacing w:lineRule="auto" w:line="276" w:before="0" w:after="140"/>
         <w:jc w:val="start"/>
         <w:rPr/>
       </w:pPr>
@@ -2659,7 +4047,7 @@
       <w:pPr>
         <w:pStyle w:val="BodyText"/>
         <w:bidi w:val="0"/>
-        <w:spacing w:before="0" w:after="283"/>
+        <w:spacing w:lineRule="auto" w:line="276" w:before="0" w:after="140"/>
         <w:jc w:val="start"/>
         <w:rPr/>
       </w:pPr>
@@ -2682,7 +4070,7 @@
       <w:pPr>
         <w:pStyle w:val="BodyText"/>
         <w:bidi w:val="0"/>
-        <w:spacing w:before="0" w:after="283"/>
+        <w:spacing w:lineRule="auto" w:line="276" w:before="0" w:after="140"/>
         <w:jc w:val="start"/>
         <w:rPr/>
       </w:pPr>
@@ -2705,7 +4093,7 @@
       <w:pPr>
         <w:pStyle w:val="BodyText"/>
         <w:bidi w:val="0"/>
-        <w:spacing w:before="0" w:after="283"/>
+        <w:spacing w:lineRule="auto" w:line="276" w:before="0" w:after="140"/>
         <w:jc w:val="start"/>
         <w:rPr/>
       </w:pPr>
@@ -2725,9 +4113,9 @@
       </w:r>
     </w:p>
     <w:sectPr>
-      <w:type w:val="nextPage"/>
-      <w:pgSz w:w="11906" w:h="16838"/>
-      <w:pgMar w:left="1417" w:right="1134" w:gutter="0" w:header="0" w:top="1134" w:footer="0" w:bottom="1134"/>
+      <w:type w:val="continuous"/>
+      <w:pgSz w:w="12240" w:h="15840"/>
+      <w:pgMar w:left="1417" w:right="1134" w:gutter="0" w:header="1134" w:top="2438" w:footer="1134" w:bottom="2475"/>
       <w:pgNumType w:fmt="decimal"/>
       <w:formProt w:val="false"/>
       <w:textDirection w:val="lrTb"/>
@@ -2735,6 +4123,374 @@
     </w:sectPr>
   </w:body>
 </w:document>
+</file>
+
+<file path=word/footer1.xml><?xml version="1.0" encoding="utf-8"?>
+<w:ftr xmlns:o="urn:schemas-microsoft-com:office:office" xmlns:r="http://schemas.openxmlformats.org/officeDocument/2006/relationships" xmlns:v="urn:schemas-microsoft-com:vml" xmlns:w="http://schemas.openxmlformats.org/wordprocessingml/2006/main" xmlns:w10="urn:schemas-microsoft-com:office:word" xmlns:wp="http://schemas.openxmlformats.org/drawingml/2006/wordprocessingDrawing" xmlns:pic="http://schemas.openxmlformats.org/drawingml/2006/picture" xmlns:wps="http://schemas.microsoft.com/office/word/2010/wordprocessingShape" xmlns:wpg="http://schemas.microsoft.com/office/word/2010/wordprocessingGroup" xmlns:mc="http://schemas.openxmlformats.org/markup-compatibility/2006" xmlns:wp14="http://schemas.microsoft.com/office/word/2010/wordprocessingDrawing" xmlns:w14="http://schemas.microsoft.com/office/word/2010/wordml" xmlns:w15="http://schemas.microsoft.com/office/word/2012/wordml" mc:Ignorable="w14 wp14 w15">
+  <w:p>
+    <w:pPr>
+      <w:pStyle w:val="BodyText"/>
+      <w:bidi w:val="0"/>
+      <w:spacing w:lineRule="auto" w:line="240" w:before="0" w:after="0"/>
+      <w:ind w:hanging="0" w:start="0" w:end="0"/>
+      <w:jc w:val="center"/>
+      <w:rPr>
+        <w:lang w:val="en-GB"/>
+      </w:rPr>
+    </w:pPr>
+    <w:r>
+      <w:drawing>
+        <wp:anchor distT="0" distB="0" distL="114300" distR="114300" simplePos="0" relativeHeight="18" behindDoc="0" locked="0" layoutInCell="1" allowOverlap="1">
+          <wp:simplePos x="0" y="0"/>
+          <wp:positionH relativeFrom="column">
+            <wp:align>left</wp:align>
+          </wp:positionH>
+          <wp:positionV relativeFrom="line">
+            <wp:align>bottom</wp:align>
+          </wp:positionV>
+          <wp:extent cx="7772400" cy="321310"/>
+          <wp:effectExtent l="0" t="0" r="0" b="0"/>
+          <wp:wrapSquare wrapText="right"/>
+          <wp:docPr id="1" name="Picture 15"/>
+          <wp:cNvGraphicFramePr>
+            <a:graphicFrameLocks xmlns:a="http://schemas.openxmlformats.org/drawingml/2006/main" noChangeAspect="1"/>
+          </wp:cNvGraphicFramePr>
+          <a:graphic xmlns:a="http://schemas.openxmlformats.org/drawingml/2006/main">
+            <a:graphicData uri="http://schemas.openxmlformats.org/drawingml/2006/picture">
+              <pic:pic xmlns:pic="http://schemas.openxmlformats.org/drawingml/2006/picture">
+                <pic:nvPicPr>
+                  <pic:cNvPr id="1" name="Picture 15"/>
+                  <pic:cNvPicPr>
+                    <a:picLocks noChangeAspect="1" noChangeArrowheads="1"/>
+                  </pic:cNvPicPr>
+                </pic:nvPicPr>
+                <pic:blipFill>
+                  <a:blip r:link="rId4"/>
+                  <a:stretch>
+                    <a:fillRect/>
+                  </a:stretch>
+                </pic:blipFill>
+                <pic:spPr bwMode="auto">
+                  <a:xfrm>
+                    <a:off x="0" y="0"/>
+                    <a:ext cx="7772400" cy="321310"/>
+                  </a:xfrm>
+                  <a:prstGeom prst="rect">
+                    <a:avLst/>
+                  </a:prstGeom>
+                  <a:noFill/>
+                </pic:spPr>
+              </pic:pic>
+            </a:graphicData>
+          </a:graphic>
+        </wp:anchor>
+      </w:drawing>
+    </w:r>
+    <w:r>
+      <w:rPr>
+        <w:color w:val="FFFFFF"/>
+        <w:lang w:val="en-GB"/>
+      </w:rPr>
+      <w:t xml:space="preserve">P age </w:t>
+    </w:r>
+    <w:r>
+      <w:rPr>
+        <w:color w:val="FFFFFF"/>
+        <w:shd w:fill="C0C0C0" w:val="clear"/>
+        <w:lang w:val="en-GB"/>
+      </w:rPr>
+      <w:fldChar w:fldCharType="begin"/>
+    </w:r>
+    <w:r>
+      <w:rPr>
+        <w:color w:val="FFFFFF"/>
+        <w:shd w:fill="C0C0C0" w:val="clear"/>
+        <w:lang w:val="en-GB"/>
+      </w:rPr>
+      <w:instrText xml:space="preserve"> PAGE </w:instrText>
+    </w:r>
+    <w:r>
+      <w:rPr>
+        <w:color w:val="FFFFFF"/>
+        <w:shd w:fill="C0C0C0" w:val="clear"/>
+        <w:lang w:val="en-GB"/>
+      </w:rPr>
+      <w:fldChar w:fldCharType="separate"/>
+    </w:r>
+    <w:r>
+      <w:rPr>
+        <w:color w:val="FFFFFF"/>
+        <w:shd w:fill="C0C0C0" w:val="clear"/>
+        <w:lang w:val="en-GB"/>
+      </w:rPr>
+      <w:t>10</w:t>
+    </w:r>
+    <w:r>
+      <w:rPr>
+        <w:color w:val="FFFFFF"/>
+        <w:shd w:fill="C0C0C0" w:val="clear"/>
+        <w:lang w:val="en-GB"/>
+      </w:rPr>
+      <w:fldChar w:fldCharType="end"/>
+    </w:r>
+    <w:r>
+      <w:rPr>
+        <w:color w:val="FFFFFF"/>
+        <w:lang w:val="en-GB"/>
+      </w:rPr>
+      <w:t xml:space="preserve"> of </w:t>
+    </w:r>
+    <w:r>
+      <w:rPr>
+        <w:color w:val="FFFFFF"/>
+        <w:shd w:fill="C0C0C0" w:val="clear"/>
+        <w:lang w:val="en-GB"/>
+      </w:rPr>
+      <w:fldChar w:fldCharType="begin"/>
+    </w:r>
+    <w:r>
+      <w:rPr>
+        <w:color w:val="FFFFFF"/>
+        <w:shd w:fill="C0C0C0" w:val="clear"/>
+        <w:lang w:val="en-GB"/>
+      </w:rPr>
+      <w:instrText xml:space="preserve"> NUMPAGES \* ARABIC </w:instrText>
+    </w:r>
+    <w:r>
+      <w:rPr>
+        <w:color w:val="FFFFFF"/>
+        <w:shd w:fill="C0C0C0" w:val="clear"/>
+        <w:lang w:val="en-GB"/>
+      </w:rPr>
+      <w:fldChar w:fldCharType="separate"/>
+    </w:r>
+    <w:r>
+      <w:rPr>
+        <w:color w:val="FFFFFF"/>
+        <w:shd w:fill="C0C0C0" w:val="clear"/>
+        <w:lang w:val="en-GB"/>
+      </w:rPr>
+      <w:t>10</w:t>
+    </w:r>
+    <w:r>
+      <w:rPr>
+        <w:color w:val="FFFFFF"/>
+        <w:shd w:fill="C0C0C0" w:val="clear"/>
+        <w:lang w:val="en-GB"/>
+      </w:rPr>
+      <w:fldChar w:fldCharType="end"/>
+    </w:r>
+  </w:p>
+  <w:p>
+    <w:pPr>
+      <w:pStyle w:val="BodyText"/>
+      <w:bidi w:val="0"/>
+      <w:spacing w:lineRule="auto" w:line="240" w:before="0" w:after="0"/>
+      <w:ind w:hanging="0" w:start="0" w:end="0"/>
+      <w:jc w:val="start"/>
+      <w:rPr/>
+    </w:pPr>
+    <w:r>
+      <w:rPr/>
+    </w:r>
+    <w:r>
+      <mc:AlternateContent>
+        <mc:Choice Requires="wps">
+          <w:drawing>
+            <wp:anchor distT="0" distB="0" distL="0" distR="0" simplePos="0" relativeHeight="28" behindDoc="0" locked="0" layoutInCell="1" allowOverlap="1">
+              <wp:simplePos x="0" y="0"/>
+              <wp:positionH relativeFrom="column">
+                <wp:align>left</wp:align>
+              </wp:positionH>
+              <wp:positionV relativeFrom="line">
+                <wp:posOffset>635</wp:posOffset>
+              </wp:positionV>
+              <wp:extent cx="4224655" cy="321310"/>
+              <wp:effectExtent l="0" t="0" r="0" b="0"/>
+              <wp:wrapSquare wrapText="right"/>
+              <wp:docPr id="2" name="Frame2"/>
+              <a:graphic xmlns:a="http://schemas.openxmlformats.org/drawingml/2006/main">
+                <a:graphicData uri="http://schemas.microsoft.com/office/word/2010/wordprocessingShape">
+                  <wps:wsp>
+                    <wps:cNvSpPr txBox="1"/>
+                    <wps:spPr>
+                      <a:xfrm>
+                        <a:off x="0" y="0"/>
+                        <a:ext cx="4224655" cy="321310"/>
+                      </a:xfrm>
+                      <a:prstGeom prst="rect"/>
+                      <a:solidFill>
+                        <a:srgbClr val="FFFFFF"/>
+                      </a:solidFill>
+                    </wps:spPr>
+                    <wps:txbx>
+                      <w:txbxContent>
+                        <w:p>
+                          <w:pPr>
+                            <w:pStyle w:val="BodyText"/>
+                            <w:bidi w:val="0"/>
+                            <w:spacing w:lineRule="auto" w:line="240" w:before="0" w:after="0"/>
+                            <w:ind w:hanging="0" w:start="0" w:end="0"/>
+                            <w:jc w:val="start"/>
+                            <w:rPr>
+                              <w:color w:val="FFFFFF"/>
+                              <w:shd w:fill="C0C0C0" w:val="clear"/>
+                            </w:rPr>
+                          </w:pPr>
+                          <w:r>
+                            <w:rPr>
+                              <w:color w:val="FFFFFF"/>
+                              <w:shd w:fill="C0C0C0" w:val="clear"/>
+                            </w:rPr>
+                            <w:fldChar w:fldCharType="begin"/>
+                          </w:r>
+                          <w:r>
+                            <w:rPr>
+                              <w:color w:val="FFFFFF"/>
+                              <w:shd w:fill="C0C0C0" w:val="clear"/>
+                            </w:rPr>
+                            <w:instrText xml:space="preserve"> FILENAME </w:instrText>
+                          </w:r>
+                          <w:r>
+                            <w:rPr>
+                              <w:color w:val="FFFFFF"/>
+                              <w:shd w:fill="C0C0C0" w:val="clear"/>
+                            </w:rPr>
+                            <w:fldChar w:fldCharType="separate"/>
+                          </w:r>
+                          <w:r>
+                            <w:rPr>
+                              <w:color w:val="FFFFFF"/>
+                              <w:shd w:fill="C0C0C0" w:val="clear"/>
+                            </w:rPr>
+                            <w:t>full-embed.odt</w:t>
+                          </w:r>
+                          <w:r>
+                            <w:rPr>
+                              <w:color w:val="FFFFFF"/>
+                              <w:shd w:fill="C0C0C0" w:val="clear"/>
+                            </w:rPr>
+                            <w:fldChar w:fldCharType="end"/>
+                          </w:r>
+                        </w:p>
+                        <w:p>
+                          <w:pPr>
+                            <w:pStyle w:val="BodyText"/>
+                            <w:bidi w:val="0"/>
+                            <w:spacing w:lineRule="auto" w:line="240" w:before="0" w:after="0"/>
+                            <w:ind w:hanging="0" w:start="0" w:end="0"/>
+                            <w:jc w:val="start"/>
+                            <w:rPr/>
+                          </w:pPr>
+                          <w:r>
+                            <w:rPr/>
+                          </w:r>
+                        </w:p>
+                      </w:txbxContent>
+                    </wps:txbx>
+                    <wps:bodyPr anchor="t" lIns="0" tIns="0" rIns="0" bIns="0">
+                      <a:noAutofit/>
+                    </wps:bodyPr>
+                  </wps:wsp>
+                </a:graphicData>
+              </a:graphic>
+            </wp:anchor>
+          </w:drawing>
+        </mc:Choice>
+        <mc:Fallback>
+          <w:pict>
+            <v:rect style="position:absolute;rotation:-0;width:332.65pt;height:25.3pt;mso-wrap-distance-left:0pt;mso-wrap-distance-right:0pt;mso-wrap-distance-top:0pt;mso-wrap-distance-bottom:0pt;margin-top:0pt;mso-position-vertical:top;mso-position-vertical-relative:text;margin-left:0pt;mso-position-horizontal:left;mso-position-horizontal-relative:text">
+              <v:textbox inset="0in,0in,0in,0in">
+                <w:txbxContent>
+                  <w:p>
+                    <w:pPr>
+                      <w:pStyle w:val="BodyText"/>
+                      <w:bidi w:val="0"/>
+                      <w:spacing w:lineRule="auto" w:line="240" w:before="0" w:after="0"/>
+                      <w:ind w:hanging="0" w:start="0" w:end="0"/>
+                      <w:jc w:val="start"/>
+                      <w:rPr>
+                        <w:color w:val="FFFFFF"/>
+                        <w:shd w:fill="C0C0C0" w:val="clear"/>
+                      </w:rPr>
+                    </w:pPr>
+                    <w:r>
+                      <w:rPr>
+                        <w:color w:val="FFFFFF"/>
+                        <w:shd w:fill="C0C0C0" w:val="clear"/>
+                      </w:rPr>
+                      <w:fldChar w:fldCharType="begin"/>
+                    </w:r>
+                    <w:r>
+                      <w:rPr>
+                        <w:color w:val="FFFFFF"/>
+                        <w:shd w:fill="C0C0C0" w:val="clear"/>
+                      </w:rPr>
+                      <w:instrText xml:space="preserve"> FILENAME </w:instrText>
+                    </w:r>
+                    <w:r>
+                      <w:rPr>
+                        <w:color w:val="FFFFFF"/>
+                        <w:shd w:fill="C0C0C0" w:val="clear"/>
+                      </w:rPr>
+                      <w:fldChar w:fldCharType="separate"/>
+                    </w:r>
+                    <w:r>
+                      <w:rPr>
+                        <w:color w:val="FFFFFF"/>
+                        <w:shd w:fill="C0C0C0" w:val="clear"/>
+                      </w:rPr>
+                      <w:t>full-embed.odt</w:t>
+                    </w:r>
+                    <w:r>
+                      <w:rPr>
+                        <w:color w:val="FFFFFF"/>
+                        <w:shd w:fill="C0C0C0" w:val="clear"/>
+                      </w:rPr>
+                      <w:fldChar w:fldCharType="end"/>
+                    </w:r>
+                  </w:p>
+                  <w:p>
+                    <w:pPr>
+                      <w:pStyle w:val="BodyText"/>
+                      <w:bidi w:val="0"/>
+                      <w:spacing w:lineRule="auto" w:line="240" w:before="0" w:after="0"/>
+                      <w:ind w:hanging="0" w:start="0" w:end="0"/>
+                      <w:jc w:val="start"/>
+                      <w:rPr/>
+                    </w:pPr>
+                    <w:r>
+                      <w:rPr/>
+                    </w:r>
+                  </w:p>
+                </w:txbxContent>
+              </v:textbox>
+              <w10:wrap type="square" side="right"/>
+            </v:rect>
+          </w:pict>
+        </mc:Fallback>
+      </mc:AlternateContent>
+    </w:r>
+  </w:p>
+</w:ftr>
+</file>
+
+<file path=word/header1.xml><?xml version="1.0" encoding="utf-8"?>
+<w:hdr xmlns:o="urn:schemas-microsoft-com:office:office" xmlns:r="http://schemas.openxmlformats.org/officeDocument/2006/relationships" xmlns:v="urn:schemas-microsoft-com:vml" xmlns:w="http://schemas.openxmlformats.org/wordprocessingml/2006/main" xmlns:w10="urn:schemas-microsoft-com:office:word" xmlns:wp="http://schemas.openxmlformats.org/drawingml/2006/wordprocessingDrawing" xmlns:pic="http://schemas.openxmlformats.org/drawingml/2006/picture" xmlns:wps="http://schemas.microsoft.com/office/word/2010/wordprocessingShape" xmlns:wpg="http://schemas.microsoft.com/office/word/2010/wordprocessingGroup" xmlns:mc="http://schemas.openxmlformats.org/markup-compatibility/2006" xmlns:wp14="http://schemas.microsoft.com/office/word/2010/wordprocessingDrawing" xmlns:w14="http://schemas.microsoft.com/office/word/2010/wordml" xmlns:w15="http://schemas.microsoft.com/office/word/2012/wordml" mc:Ignorable="w14 wp14 w15">
+  <w:p>
+    <w:pPr>
+      <w:pStyle w:val="BodyText"/>
+      <w:bidi w:val="0"/>
+      <w:spacing w:lineRule="auto" w:line="240" w:before="0" w:after="140"/>
+      <w:ind w:hanging="0" w:start="0" w:end="0"/>
+      <w:jc w:val="start"/>
+      <w:rPr/>
+    </w:pPr>
+    <w:r>
+      <w:rPr/>
+    </w:r>
+  </w:p>
+</w:hdr>
 </file>
 
 <file path=word/styles.xml><?xml version="1.0" encoding="utf-8"?>
@@ -2778,8 +4534,16 @@
     <w:basedOn w:val="Heading"/>
     <w:next w:val="BodyText"/>
     <w:qFormat/>
-    <w:pPr/>
+    <w:pPr>
+      <w:numPr>
+        <w:ilvl w:val="0"/>
+        <w:numId w:val="0"/>
+      </w:numPr>
+      <w:spacing w:before="240" w:after="120"/>
+      <w:outlineLvl w:val="0"/>
+    </w:pPr>
     <w:rPr>
+      <w:rFonts w:ascii="Liberation Serif" w:hAnsi="Liberation Serif" w:eastAsia="DejaVu Sans" w:cs="Noto Sans Devanagari"/>
       <w:b/>
       <w:bCs/>
       <w:sz w:val="32"/>
@@ -2828,35 +4592,6 @@
       <w:szCs w:val="24"/>
     </w:rPr>
   </w:style>
-  <w:style w:type="character" w:styleId="EndnoteReference">
-    <w:name w:val="endnote reference"/>
-    <w:rPr>
-      <w:vertAlign w:val="superscript"/>
-    </w:rPr>
-  </w:style>
-  <w:style w:type="character" w:styleId="FootnoteReference">
-    <w:name w:val="footnote reference"/>
-    <w:rPr>
-      <w:vertAlign w:val="superscript"/>
-    </w:rPr>
-  </w:style>
-  <w:style w:type="character" w:styleId="EndnoteCharacters">
-    <w:name w:val="Endnote Characters"/>
-    <w:qFormat/>
-    <w:rPr/>
-  </w:style>
-  <w:style w:type="character" w:styleId="FootnoteCharacters">
-    <w:name w:val="Footnote Characters"/>
-    <w:qFormat/>
-    <w:rPr/>
-  </w:style>
-  <w:style w:type="character" w:styleId="Hyperlink">
-    <w:name w:val="Hyperlink"/>
-    <w:rPr>
-      <w:color w:val="000080"/>
-      <w:u w:val="single"/>
-    </w:rPr>
-  </w:style>
   <w:style w:type="character" w:styleId="SourceText">
     <w:name w:val="Source Text"/>
     <w:qFormat/>
@@ -2872,44 +4607,6 @@
       <w:iCs/>
     </w:rPr>
   </w:style>
-  <w:style w:type="paragraph" w:styleId="HorizontalLine">
-    <w:name w:val="Horizontal Line"/>
-    <w:basedOn w:val="Normal"/>
-    <w:next w:val="BodyText"/>
-    <w:qFormat/>
-    <w:pPr>
-      <w:pBdr>
-        <w:bottom w:val="double" w:sz="2" w:space="0" w:color="808080"/>
-      </w:pBdr>
-      <w:spacing w:before="0" w:after="283"/>
-    </w:pPr>
-    <w:rPr>
-      <w:sz w:val="12"/>
-    </w:rPr>
-  </w:style>
-  <w:style w:type="paragraph" w:styleId="BodyText">
-    <w:name w:val="Body Text"/>
-    <w:basedOn w:val="Normal"/>
-    <w:pPr>
-      <w:spacing w:before="0" w:after="283"/>
-    </w:pPr>
-    <w:rPr/>
-  </w:style>
-  <w:style w:type="paragraph" w:styleId="EnvelopeReturn">
-    <w:name w:val="envelope return"/>
-    <w:basedOn w:val="Normal"/>
-    <w:pPr/>
-    <w:rPr>
-      <w:i/>
-    </w:rPr>
-  </w:style>
-  <w:style w:type="paragraph" w:styleId="TableContents">
-    <w:name w:val="Table Contents"/>
-    <w:basedOn w:val="BodyText"/>
-    <w:qFormat/>
-    <w:pPr/>
-    <w:rPr/>
-  </w:style>
   <w:style w:type="paragraph" w:styleId="Heading">
     <w:name w:val="Heading"/>
     <w:basedOn w:val="Normal"/>
@@ -2917,21 +4614,26 @@
     <w:qFormat/>
     <w:pPr>
       <w:keepNext w:val="true"/>
-      <w:spacing w:before="240" w:after="283"/>
+      <w:spacing w:before="240" w:after="120"/>
     </w:pPr>
     <w:rPr>
-      <w:rFonts w:ascii="Liberation Sans" w:hAnsi="Liberation Sans"/>
+      <w:rFonts w:ascii="Liberation Sans" w:hAnsi="Liberation Sans" w:eastAsia="DejaVu Sans" w:cs="Noto Sans Devanagari"/>
       <w:sz w:val="28"/>
       <w:szCs w:val="28"/>
     </w:rPr>
   </w:style>
-  <w:style w:type="paragraph" w:styleId="Index">
-    <w:name w:val="Index"/>
+  <w:style w:type="paragraph" w:styleId="BodyText">
+    <w:name w:val="Body Text"/>
     <w:basedOn w:val="Normal"/>
-    <w:qFormat/>
     <w:pPr>
-      <w:suppressLineNumbers/>
+      <w:spacing w:lineRule="auto" w:line="276" w:before="0" w:after="140"/>
     </w:pPr>
+    <w:rPr/>
+  </w:style>
+  <w:style w:type="paragraph" w:styleId="List">
+    <w:name w:val="List"/>
+    <w:basedOn w:val="BodyText"/>
+    <w:pPr/>
     <w:rPr>
       <w:rFonts w:cs="Noto Sans Devanagari"/>
     </w:rPr>
@@ -2952,13 +4654,48 @@
       <w:szCs w:val="24"/>
     </w:rPr>
   </w:style>
-  <w:style w:type="paragraph" w:styleId="List">
-    <w:name w:val="List"/>
-    <w:basedOn w:val="BodyText"/>
-    <w:pPr/>
+  <w:style w:type="paragraph" w:styleId="Index">
+    <w:name w:val="Index"/>
+    <w:basedOn w:val="Normal"/>
+    <w:qFormat/>
+    <w:pPr>
+      <w:suppressLineNumbers/>
+    </w:pPr>
     <w:rPr>
       <w:rFonts w:cs="Noto Sans Devanagari"/>
     </w:rPr>
+  </w:style>
+  <w:style w:type="paragraph" w:styleId="HeaderandFooter">
+    <w:name w:val="Header and Footer"/>
+    <w:basedOn w:val="Normal"/>
+    <w:qFormat/>
+    <w:pPr>
+      <w:suppressLineNumbers/>
+      <w:tabs>
+        <w:tab w:val="clear" w:pos="709"/>
+        <w:tab w:val="center" w:pos="4986" w:leader="none"/>
+        <w:tab w:val="right" w:pos="9972" w:leader="none"/>
+      </w:tabs>
+    </w:pPr>
+    <w:rPr/>
+  </w:style>
+  <w:style w:type="paragraph" w:styleId="Header">
+    <w:name w:val="header"/>
+    <w:basedOn w:val="HeaderandFooter"/>
+    <w:pPr>
+      <w:suppressLineNumbers/>
+    </w:pPr>
+    <w:rPr/>
+  </w:style>
+  <w:style w:type="paragraph" w:styleId="TableContents">
+    <w:name w:val="Table Contents"/>
+    <w:basedOn w:val="Normal"/>
+    <w:qFormat/>
+    <w:pPr>
+      <w:widowControl w:val="false"/>
+      <w:suppressLineNumbers/>
+    </w:pPr>
+    <w:rPr/>
   </w:style>
   <w:style w:type="paragraph" w:styleId="TableHeading">
     <w:name w:val="Table Heading"/>
@@ -2973,13 +4710,28 @@
       <w:bCs/>
     </w:rPr>
   </w:style>
+  <w:style w:type="paragraph" w:styleId="Footer">
+    <w:name w:val="footer"/>
+    <w:basedOn w:val="HeaderandFooter"/>
+    <w:pPr>
+      <w:suppressLineNumbers/>
+    </w:pPr>
+    <w:rPr/>
+  </w:style>
   <w:style w:type="paragraph" w:styleId="BodyTextwc">
     <w:name w:val="Body Text.wc"/>
     <w:basedOn w:val="BodyText"/>
     <w:qFormat/>
     <w:pPr>
-      <w:spacing w:before="360" w:after="283"/>
+      <w:spacing w:before="360" w:after="140"/>
     </w:pPr>
+    <w:rPr/>
+  </w:style>
+  <w:style w:type="paragraph" w:styleId="FrameContents">
+    <w:name w:val="Frame Contents"/>
+    <w:basedOn w:val="Normal"/>
+    <w:qFormat/>
+    <w:pPr/>
     <w:rPr/>
   </w:style>
 </w:styles>

</xml_diff>